<commit_message>
additions to the document
</commit_message>
<xml_diff>
--- a/BIT3208_Project/Project_documentation.docx
+++ b/BIT3208_Project/Project_documentation.docx
@@ -122,6 +122,9 @@
       </w:r>
       <w:r>
         <w:t xml:space="preserve"> </w:t>
+      </w:r>
+      <w:r>
+        <w:t>https://github.com/ivanamani/BIT3208_Project</w:t>
       </w:r>
     </w:p>
     <w:p>
@@ -206,7 +209,7 @@
           <w:r>
             <w:fldChar w:fldCharType="separate"/>
           </w:r>
-          <w:hyperlink w:anchor="_Toc230523407" w:history="1">
+          <w:hyperlink w:anchor="_Toc230817731" w:history="1">
             <w:r>
               <w:rPr>
                 <w:rStyle w:val="Hyperlink"/>
@@ -233,7 +236,7 @@
                 <w:noProof/>
                 <w:webHidden/>
               </w:rPr>
-              <w:instrText xml:space="preserve"> PAGEREF _Toc230523407 \h </w:instrText>
+              <w:instrText xml:space="preserve"> PAGEREF _Toc230817731 \h </w:instrText>
             </w:r>
             <w:r>
               <w:rPr>
@@ -275,7 +278,7 @@
               <w:noProof/>
             </w:rPr>
           </w:pPr>
-          <w:hyperlink w:anchor="_Toc230523408" w:history="1">
+          <w:hyperlink w:anchor="_Toc230817732" w:history="1">
             <w:r>
               <w:rPr>
                 <w:rStyle w:val="Hyperlink"/>
@@ -311,7 +314,7 @@
                 <w:noProof/>
                 <w:webHidden/>
               </w:rPr>
-              <w:instrText xml:space="preserve"> PAGEREF _Toc230523408 \h </w:instrText>
+              <w:instrText xml:space="preserve"> PAGEREF _Toc230817732 \h </w:instrText>
             </w:r>
             <w:r>
               <w:rPr>
@@ -353,7 +356,7 @@
               <w:noProof/>
             </w:rPr>
           </w:pPr>
-          <w:hyperlink w:anchor="_Toc230523409" w:history="1">
+          <w:hyperlink w:anchor="_Toc230817733" w:history="1">
             <w:r>
               <w:rPr>
                 <w:rStyle w:val="Hyperlink"/>
@@ -380,7 +383,7 @@
                 <w:noProof/>
                 <w:webHidden/>
               </w:rPr>
-              <w:instrText xml:space="preserve"> PAGEREF _Toc230523409 \h </w:instrText>
+              <w:instrText xml:space="preserve"> PAGEREF _Toc230817733 \h </w:instrText>
             </w:r>
             <w:r>
               <w:rPr>
@@ -422,7 +425,7 @@
               <w:noProof/>
             </w:rPr>
           </w:pPr>
-          <w:hyperlink w:anchor="_Toc230523410" w:history="1">
+          <w:hyperlink w:anchor="_Toc230817734" w:history="1">
             <w:r>
               <w:rPr>
                 <w:rStyle w:val="Hyperlink"/>
@@ -449,7 +452,7 @@
                 <w:noProof/>
                 <w:webHidden/>
               </w:rPr>
-              <w:instrText xml:space="preserve"> PAGEREF _Toc230523410 \h </w:instrText>
+              <w:instrText xml:space="preserve"> PAGEREF _Toc230817734 \h </w:instrText>
             </w:r>
             <w:r>
               <w:rPr>
@@ -491,7 +494,7 @@
               <w:noProof/>
             </w:rPr>
           </w:pPr>
-          <w:hyperlink w:anchor="_Toc230523411" w:history="1">
+          <w:hyperlink w:anchor="_Toc230817735" w:history="1">
             <w:r>
               <w:rPr>
                 <w:rStyle w:val="Hyperlink"/>
@@ -518,7 +521,7 @@
                 <w:noProof/>
                 <w:webHidden/>
               </w:rPr>
-              <w:instrText xml:space="preserve"> PAGEREF _Toc230523411 \h </w:instrText>
+              <w:instrText xml:space="preserve"> PAGEREF _Toc230817735 \h </w:instrText>
             </w:r>
             <w:r>
               <w:rPr>
@@ -560,7 +563,7 @@
               <w:noProof/>
             </w:rPr>
           </w:pPr>
-          <w:hyperlink w:anchor="_Toc230523412" w:history="1">
+          <w:hyperlink w:anchor="_Toc230817736" w:history="1">
             <w:r>
               <w:rPr>
                 <w:rStyle w:val="Hyperlink"/>
@@ -587,7 +590,7 @@
                 <w:noProof/>
                 <w:webHidden/>
               </w:rPr>
-              <w:instrText xml:space="preserve"> PAGEREF _Toc230523412 \h </w:instrText>
+              <w:instrText xml:space="preserve"> PAGEREF _Toc230817736 \h </w:instrText>
             </w:r>
             <w:r>
               <w:rPr>
@@ -608,6 +611,221 @@
                 <w:webHidden/>
               </w:rPr>
               <w:t>8</w:t>
+            </w:r>
+            <w:r>
+              <w:rPr>
+                <w:noProof/>
+                <w:webHidden/>
+              </w:rPr>
+              <w:fldChar w:fldCharType="end"/>
+            </w:r>
+          </w:hyperlink>
+        </w:p>
+        <w:p>
+          <w:pPr>
+            <w:pStyle w:val="TOC1"/>
+            <w:tabs>
+              <w:tab w:val="right" w:leader="dot" w:pos="9350"/>
+            </w:tabs>
+            <w:rPr>
+              <w:rFonts w:eastAsiaTheme="minorEastAsia"/>
+              <w:noProof/>
+            </w:rPr>
+          </w:pPr>
+          <w:hyperlink w:anchor="_Toc230817737" w:history="1">
+            <w:r>
+              <w:rPr>
+                <w:rStyle w:val="Hyperlink"/>
+                <w:noProof/>
+              </w:rPr>
+              <w:t>Week 3: JavaScript and PHP Basics</w:t>
+            </w:r>
+            <w:r>
+              <w:rPr>
+                <w:noProof/>
+                <w:webHidden/>
+              </w:rPr>
+              <w:tab/>
+            </w:r>
+            <w:r>
+              <w:rPr>
+                <w:noProof/>
+                <w:webHidden/>
+              </w:rPr>
+              <w:fldChar w:fldCharType="begin"/>
+            </w:r>
+            <w:r>
+              <w:rPr>
+                <w:noProof/>
+                <w:webHidden/>
+              </w:rPr>
+              <w:instrText xml:space="preserve"> PAGEREF _Toc230817737 \h </w:instrText>
+            </w:r>
+            <w:r>
+              <w:rPr>
+                <w:noProof/>
+                <w:webHidden/>
+              </w:rPr>
+            </w:r>
+            <w:r>
+              <w:rPr>
+                <w:noProof/>
+                <w:webHidden/>
+              </w:rPr>
+              <w:fldChar w:fldCharType="separate"/>
+            </w:r>
+            <w:r>
+              <w:rPr>
+                <w:noProof/>
+                <w:webHidden/>
+              </w:rPr>
+              <w:t>9</w:t>
+            </w:r>
+            <w:r>
+              <w:rPr>
+                <w:noProof/>
+                <w:webHidden/>
+              </w:rPr>
+              <w:fldChar w:fldCharType="end"/>
+            </w:r>
+          </w:hyperlink>
+        </w:p>
+        <w:p>
+          <w:pPr>
+            <w:pStyle w:val="TOC2"/>
+            <w:tabs>
+              <w:tab w:val="right" w:leader="dot" w:pos="9350"/>
+            </w:tabs>
+            <w:rPr>
+              <w:rFonts w:eastAsiaTheme="minorEastAsia"/>
+              <w:noProof/>
+            </w:rPr>
+          </w:pPr>
+          <w:hyperlink w:anchor="_Toc230817738" w:history="1">
+            <w:r>
+              <w:rPr>
+                <w:rStyle w:val="Hyperlink"/>
+                <w:noProof/>
+              </w:rPr>
+              <w:t xml:space="preserve">TITLE: </w:t>
+            </w:r>
+            <w:r>
+              <w:rPr>
+                <w:rStyle w:val="Hyperlink"/>
+                <w:caps/>
+                <w:noProof/>
+              </w:rPr>
+              <w:t>Frontend Interaction and Backend Foundations</w:t>
+            </w:r>
+            <w:r>
+              <w:rPr>
+                <w:noProof/>
+                <w:webHidden/>
+              </w:rPr>
+              <w:tab/>
+            </w:r>
+            <w:r>
+              <w:rPr>
+                <w:noProof/>
+                <w:webHidden/>
+              </w:rPr>
+              <w:fldChar w:fldCharType="begin"/>
+            </w:r>
+            <w:r>
+              <w:rPr>
+                <w:noProof/>
+                <w:webHidden/>
+              </w:rPr>
+              <w:instrText xml:space="preserve"> PAGEREF _Toc230817738 \h </w:instrText>
+            </w:r>
+            <w:r>
+              <w:rPr>
+                <w:noProof/>
+                <w:webHidden/>
+              </w:rPr>
+            </w:r>
+            <w:r>
+              <w:rPr>
+                <w:noProof/>
+                <w:webHidden/>
+              </w:rPr>
+              <w:fldChar w:fldCharType="separate"/>
+            </w:r>
+            <w:r>
+              <w:rPr>
+                <w:noProof/>
+                <w:webHidden/>
+              </w:rPr>
+              <w:t>9</w:t>
+            </w:r>
+            <w:r>
+              <w:rPr>
+                <w:noProof/>
+                <w:webHidden/>
+              </w:rPr>
+              <w:fldChar w:fldCharType="end"/>
+            </w:r>
+          </w:hyperlink>
+        </w:p>
+        <w:p>
+          <w:pPr>
+            <w:pStyle w:val="TOC3"/>
+            <w:tabs>
+              <w:tab w:val="right" w:leader="dot" w:pos="9350"/>
+            </w:tabs>
+            <w:rPr>
+              <w:rFonts w:eastAsiaTheme="minorEastAsia"/>
+              <w:noProof/>
+            </w:rPr>
+          </w:pPr>
+          <w:hyperlink w:anchor="_Toc230817739" w:history="1">
+            <w:r>
+              <w:rPr>
+                <w:rStyle w:val="Hyperlink"/>
+                <w:noProof/>
+              </w:rPr>
+              <w:t>Week 3 Reflection</w:t>
+            </w:r>
+            <w:r>
+              <w:rPr>
+                <w:noProof/>
+                <w:webHidden/>
+              </w:rPr>
+              <w:tab/>
+            </w:r>
+            <w:r>
+              <w:rPr>
+                <w:noProof/>
+                <w:webHidden/>
+              </w:rPr>
+              <w:fldChar w:fldCharType="begin"/>
+            </w:r>
+            <w:r>
+              <w:rPr>
+                <w:noProof/>
+                <w:webHidden/>
+              </w:rPr>
+              <w:instrText xml:space="preserve"> PAGEREF _Toc230817739 \h </w:instrText>
+            </w:r>
+            <w:r>
+              <w:rPr>
+                <w:noProof/>
+                <w:webHidden/>
+              </w:rPr>
+            </w:r>
+            <w:r>
+              <w:rPr>
+                <w:noProof/>
+                <w:webHidden/>
+              </w:rPr>
+              <w:fldChar w:fldCharType="separate"/>
+            </w:r>
+            <w:r>
+              <w:rPr>
+                <w:noProof/>
+                <w:webHidden/>
+              </w:rPr>
+              <w:t>11</w:t>
             </w:r>
             <w:r>
               <w:rPr>
@@ -655,7 +873,7 @@
       <w:pPr>
         <w:pStyle w:val="Heading1"/>
       </w:pPr>
-      <w:bookmarkStart w:id="0" w:name="_Toc230523407"/>
+      <w:bookmarkStart w:id="0" w:name="_Toc230817731"/>
       <w:r>
         <w:lastRenderedPageBreak/>
         <w:t>WEEK ONE: LOCAL ENVIRONMENT SETUP</w:t>
@@ -670,7 +888,7 @@
           <w:bCs/>
         </w:rPr>
       </w:pPr>
-      <w:bookmarkStart w:id="1" w:name="_Toc230523408"/>
+      <w:bookmarkStart w:id="1" w:name="_Toc230817732"/>
       <w:r>
         <w:t xml:space="preserve">TITLE: </w:t>
       </w:r>
@@ -1075,7 +1293,7 @@
       <w:pPr>
         <w:pStyle w:val="Heading3"/>
       </w:pPr>
-      <w:bookmarkStart w:id="2" w:name="_Toc230523409"/>
+      <w:bookmarkStart w:id="2" w:name="_Toc230817733"/>
       <w:r>
         <w:t>WEEK 1 REFLECTIONS</w:t>
       </w:r>
@@ -1111,7 +1329,7 @@
       <w:pPr>
         <w:pStyle w:val="Heading1"/>
       </w:pPr>
-      <w:bookmarkStart w:id="3" w:name="_Toc230523410"/>
+      <w:bookmarkStart w:id="3" w:name="_Toc230817734"/>
       <w:r>
         <w:t>WEEK 2: WIREFRAMES AND GUI DESIGN.</w:t>
       </w:r>
@@ -1121,7 +1339,13 @@
       <w:pPr>
         <w:pStyle w:val="Heading2"/>
       </w:pPr>
-      <w:bookmarkStart w:id="4" w:name="_Toc230523411"/>
+      <w:bookmarkStart w:id="4" w:name="_Toc230817735"/>
+      <w:r>
+        <w:t>TITLE: USER INTERFACEE PLANNING AND SYSTEM DESIGN</w:t>
+      </w:r>
+      <w:bookmarkEnd w:id="4"/>
+    </w:p>
+    <w:p>
       <w:r>
         <w:rPr>
           <w:noProof/>
@@ -1129,18 +1353,18 @@
         <mc:AlternateContent>
           <mc:Choice Requires="wpg">
             <w:drawing>
-              <wp:anchor distT="0" distB="0" distL="114300" distR="114300" simplePos="0" relativeHeight="251649024" behindDoc="0" locked="0" layoutInCell="1" allowOverlap="1" wp14:anchorId="076FE411" wp14:editId="009AB76C">
+              <wp:anchor distT="0" distB="0" distL="114300" distR="114300" simplePos="0" relativeHeight="251738112" behindDoc="0" locked="0" layoutInCell="1" allowOverlap="1" wp14:anchorId="4944A436" wp14:editId="25727556">
                 <wp:simplePos x="0" y="0"/>
                 <wp:positionH relativeFrom="column">
-                  <wp:posOffset>-436418</wp:posOffset>
+                  <wp:posOffset>-434340</wp:posOffset>
                 </wp:positionH>
                 <wp:positionV relativeFrom="paragraph">
-                  <wp:posOffset>468515</wp:posOffset>
+                  <wp:posOffset>80645</wp:posOffset>
                 </wp:positionV>
-                <wp:extent cx="6899563" cy="3207327"/>
+                <wp:extent cx="6899275" cy="3206750"/>
                 <wp:effectExtent l="0" t="0" r="0" b="0"/>
                 <wp:wrapNone/>
-                <wp:docPr id="1668984591" name="Group 4"/>
+                <wp:docPr id="993005948" name="Group 59"/>
                 <wp:cNvGraphicFramePr/>
                 <a:graphic xmlns:a="http://schemas.openxmlformats.org/drawingml/2006/main">
                   <a:graphicData uri="http://schemas.microsoft.com/office/word/2010/wordprocessingGroup">
@@ -1149,92 +1373,347 @@
                       <wpg:grpSpPr>
                         <a:xfrm>
                           <a:off x="0" y="0"/>
-                          <a:ext cx="6899563" cy="3207327"/>
+                          <a:ext cx="6899275" cy="3206750"/>
                           <a:chOff x="0" y="0"/>
-                          <a:chExt cx="4076700" cy="4617720"/>
+                          <a:chExt cx="6899275" cy="3206750"/>
                         </a:xfrm>
                       </wpg:grpSpPr>
-                      <wps:wsp>
-                        <wps:cNvPr id="2009856257" name="Rectangle: Rounded Corners 2"/>
-                        <wps:cNvSpPr/>
-                        <wps:spPr>
+                      <wpg:grpSp>
+                        <wpg:cNvPr id="1301828833" name="Group 57"/>
+                        <wpg:cNvGrpSpPr/>
+                        <wpg:grpSpPr>
                           <a:xfrm>
                             <a:off x="0" y="0"/>
-                            <a:ext cx="4076700" cy="4617720"/>
+                            <a:ext cx="6899275" cy="3206750"/>
+                            <a:chOff x="0" y="0"/>
+                            <a:chExt cx="6899275" cy="3206750"/>
                           </a:xfrm>
-                          <a:prstGeom prst="roundRect">
-                            <a:avLst/>
-                          </a:prstGeom>
-                          <a:gradFill>
-                            <a:gsLst>
-                              <a:gs pos="0">
+                        </wpg:grpSpPr>
+                        <wpg:grpSp>
+                          <wpg:cNvPr id="1789702785" name="Group 4"/>
+                          <wpg:cNvGrpSpPr/>
+                          <wpg:grpSpPr>
+                            <a:xfrm>
+                              <a:off x="0" y="0"/>
+                              <a:ext cx="6899275" cy="3206750"/>
+                              <a:chOff x="0" y="0"/>
+                              <a:chExt cx="4076700" cy="4617720"/>
+                            </a:xfrm>
+                          </wpg:grpSpPr>
+                          <wps:wsp>
+                            <wps:cNvPr id="1778381900" name="Rectangle: Rounded Corners 2"/>
+                            <wps:cNvSpPr/>
+                            <wps:spPr>
+                              <a:xfrm>
+                                <a:off x="0" y="0"/>
+                                <a:ext cx="4076700" cy="4617720"/>
+                              </a:xfrm>
+                              <a:prstGeom prst="roundRect">
+                                <a:avLst/>
+                              </a:prstGeom>
+                              <a:gradFill>
+                                <a:gsLst>
+                                  <a:gs pos="0">
+                                    <a:schemeClr val="accent1">
+                                      <a:lumMod val="5000"/>
+                                      <a:lumOff val="95000"/>
+                                    </a:schemeClr>
+                                  </a:gs>
+                                  <a:gs pos="74000">
+                                    <a:schemeClr val="accent1">
+                                      <a:lumMod val="45000"/>
+                                      <a:lumOff val="55000"/>
+                                    </a:schemeClr>
+                                  </a:gs>
+                                  <a:gs pos="83000">
+                                    <a:schemeClr val="accent1">
+                                      <a:lumMod val="45000"/>
+                                      <a:lumOff val="55000"/>
+                                    </a:schemeClr>
+                                  </a:gs>
+                                  <a:gs pos="100000">
+                                    <a:schemeClr val="accent1">
+                                      <a:lumMod val="30000"/>
+                                      <a:lumOff val="70000"/>
+                                    </a:schemeClr>
+                                  </a:gs>
+                                </a:gsLst>
+                                <a:lin ang="5400000" scaled="1"/>
+                              </a:gradFill>
+                              <a:ln>
+                                <a:noFill/>
+                              </a:ln>
+                            </wps:spPr>
+                            <wps:style>
+                              <a:lnRef idx="2">
                                 <a:schemeClr val="accent1">
-                                  <a:lumMod val="5000"/>
-                                  <a:lumOff val="95000"/>
+                                  <a:shade val="15000"/>
                                 </a:schemeClr>
-                              </a:gs>
-                              <a:gs pos="74000">
-                                <a:schemeClr val="accent1">
-                                  <a:lumMod val="45000"/>
-                                  <a:lumOff val="55000"/>
-                                </a:schemeClr>
-                              </a:gs>
-                              <a:gs pos="83000">
-                                <a:schemeClr val="accent1">
-                                  <a:lumMod val="45000"/>
-                                  <a:lumOff val="55000"/>
-                                </a:schemeClr>
-                              </a:gs>
-                              <a:gs pos="100000">
-                                <a:schemeClr val="accent1">
-                                  <a:lumMod val="30000"/>
-                                  <a:lumOff val="70000"/>
-                                </a:schemeClr>
-                              </a:gs>
-                            </a:gsLst>
-                            <a:lin ang="5400000" scaled="1"/>
-                          </a:gradFill>
-                          <a:ln>
+                              </a:lnRef>
+                              <a:fillRef idx="1">
+                                <a:schemeClr val="accent1"/>
+                              </a:fillRef>
+                              <a:effectRef idx="0">
+                                <a:schemeClr val="accent1"/>
+                              </a:effectRef>
+                              <a:fontRef idx="minor">
+                                <a:schemeClr val="lt1"/>
+                              </a:fontRef>
+                            </wps:style>
+                            <wps:bodyPr rot="0" spcFirstLastPara="0" vertOverflow="overflow" horzOverflow="overflow" vert="horz" wrap="square" lIns="91440" tIns="45720" rIns="91440" bIns="45720" numCol="1" spcCol="0" rtlCol="0" fromWordArt="0" anchor="ctr" anchorCtr="0" forceAA="0" compatLnSpc="1">
+                              <a:prstTxWarp prst="textNoShape">
+                                <a:avLst/>
+                              </a:prstTxWarp>
+                              <a:noAutofit/>
+                            </wps:bodyPr>
+                          </wps:wsp>
+                          <wps:wsp>
+                            <wps:cNvPr id="3718506" name="Text Box 3"/>
+                            <wps:cNvSpPr txBox="1"/>
+                            <wps:spPr>
+                              <a:xfrm>
+                                <a:off x="1186762" y="1554837"/>
+                                <a:ext cx="1014995" cy="541020"/>
+                              </a:xfrm>
+                              <a:prstGeom prst="rect">
+                                <a:avLst/>
+                              </a:prstGeom>
+                              <a:noFill/>
+                              <a:ln w="6350">
+                                <a:noFill/>
+                              </a:ln>
+                            </wps:spPr>
+                            <wps:txbx>
+                              <w:txbxContent>
+                                <w:p>
+                                  <w:pPr>
+                                    <w:rPr>
+                                      <w:color w:val="FFFFFF" w:themeColor="background1"/>
+                                      <w:sz w:val="48"/>
+                                      <w:szCs w:val="48"/>
+                                    </w:rPr>
+                                  </w:pPr>
+                                  <w:r>
+                                    <w:rPr>
+                                      <w:color w:val="000000" w:themeColor="text1"/>
+                                      <w:sz w:val="48"/>
+                                      <w:szCs w:val="48"/>
+                                    </w:rPr>
+                                    <w:t>USERNAME</w:t>
+                                  </w:r>
+                                </w:p>
+                              </w:txbxContent>
+                            </wps:txbx>
+                            <wps:bodyPr rot="0" spcFirstLastPara="0" vertOverflow="overflow" horzOverflow="overflow" vert="horz" wrap="square" lIns="91440" tIns="45720" rIns="91440" bIns="45720" numCol="1" spcCol="0" rtlCol="0" fromWordArt="0" anchor="t" anchorCtr="0" forceAA="0" compatLnSpc="1">
+                              <a:prstTxWarp prst="textNoShape">
+                                <a:avLst/>
+                              </a:prstTxWarp>
+                              <a:noAutofit/>
+                            </wps:bodyPr>
+                          </wps:wsp>
+                          <wps:wsp>
+                            <wps:cNvPr id="1705781337" name="Text Box 3"/>
+                            <wps:cNvSpPr txBox="1"/>
+                            <wps:spPr>
+                              <a:xfrm>
+                                <a:off x="657757" y="424198"/>
+                                <a:ext cx="2507548" cy="541020"/>
+                              </a:xfrm>
+                              <a:prstGeom prst="rect">
+                                <a:avLst/>
+                              </a:prstGeom>
+                              <a:noFill/>
+                              <a:ln w="6350">
+                                <a:noFill/>
+                              </a:ln>
+                            </wps:spPr>
+                            <wps:txbx>
+                              <w:txbxContent>
+                                <w:p>
+                                  <w:pPr>
+                                    <w:rPr>
+                                      <w:rFonts w:ascii="Algerian" w:hAnsi="Algerian"/>
+                                      <w:b/>
+                                      <w:bCs/>
+                                      <w:i/>
+                                      <w:iCs/>
+                                      <w:color w:val="000000" w:themeColor="text1"/>
+                                      <w:sz w:val="36"/>
+                                      <w:szCs w:val="36"/>
+                                      <w:u w:val="single"/>
+                                    </w:rPr>
+                                  </w:pPr>
+                                  <w:r>
+                                    <w:rPr>
+                                      <w:rFonts w:ascii="Algerian" w:hAnsi="Algerian"/>
+                                      <w:b/>
+                                      <w:bCs/>
+                                      <w:i/>
+                                      <w:iCs/>
+                                      <w:color w:val="000000" w:themeColor="text1"/>
+                                      <w:sz w:val="36"/>
+                                      <w:szCs w:val="36"/>
+                                      <w:u w:val="single"/>
+                                    </w:rPr>
+                                    <w:t>WELCOME TO THE SEA OF GAMES</w:t>
+                                  </w:r>
+                                </w:p>
+                                <w:p>
+                                  <w:pPr>
+                                    <w:rPr>
+                                      <w:rFonts w:ascii="Algerian" w:hAnsi="Algerian"/>
+                                      <w:b/>
+                                      <w:bCs/>
+                                      <w:i/>
+                                      <w:iCs/>
+                                      <w:color w:val="000000" w:themeColor="text1"/>
+                                      <w:sz w:val="36"/>
+                                      <w:szCs w:val="36"/>
+                                      <w:u w:val="single"/>
+                                    </w:rPr>
+                                  </w:pPr>
+                                </w:p>
+                              </w:txbxContent>
+                            </wps:txbx>
+                            <wps:bodyPr rot="0" spcFirstLastPara="0" vertOverflow="overflow" horzOverflow="overflow" vert="horz" wrap="square" lIns="91440" tIns="45720" rIns="91440" bIns="45720" numCol="1" spcCol="0" rtlCol="0" fromWordArt="0" anchor="t" anchorCtr="0" forceAA="0" compatLnSpc="1">
+                              <a:prstTxWarp prst="textNoShape">
+                                <a:avLst/>
+                              </a:prstTxWarp>
+                              <a:noAutofit/>
+                            </wps:bodyPr>
+                          </wps:wsp>
+                        </wpg:grpSp>
+                        <wps:wsp>
+                          <wps:cNvPr id="764474643" name="Text Box 3"/>
+                          <wps:cNvSpPr txBox="1"/>
+                          <wps:spPr>
+                            <a:xfrm>
+                              <a:off x="2008438" y="1511088"/>
+                              <a:ext cx="1645920" cy="375708"/>
+                            </a:xfrm>
+                            <a:prstGeom prst="rect">
+                              <a:avLst/>
+                            </a:prstGeom>
                             <a:noFill/>
-                          </a:ln>
-                        </wps:spPr>
-                        <wps:style>
-                          <a:lnRef idx="2">
-                            <a:schemeClr val="accent1">
-                              <a:shade val="15000"/>
-                            </a:schemeClr>
-                          </a:lnRef>
-                          <a:fillRef idx="1">
-                            <a:schemeClr val="accent1"/>
-                          </a:fillRef>
-                          <a:effectRef idx="0">
-                            <a:schemeClr val="accent1"/>
-                          </a:effectRef>
-                          <a:fontRef idx="minor">
-                            <a:schemeClr val="lt1"/>
-                          </a:fontRef>
-                        </wps:style>
-                        <wps:bodyPr rot="0" spcFirstLastPara="0" vertOverflow="overflow" horzOverflow="overflow" vert="horz" wrap="square" lIns="91440" tIns="45720" rIns="91440" bIns="45720" numCol="1" spcCol="0" rtlCol="0" fromWordArt="0" anchor="ctr" anchorCtr="0" forceAA="0" compatLnSpc="1">
-                          <a:prstTxWarp prst="textNoShape">
-                            <a:avLst/>
-                          </a:prstTxWarp>
-                          <a:noAutofit/>
-                        </wps:bodyPr>
-                      </wps:wsp>
+                            <a:ln w="6350">
+                              <a:noFill/>
+                            </a:ln>
+                          </wps:spPr>
+                          <wps:txbx>
+                            <w:txbxContent>
+                              <w:p>
+                                <w:pPr>
+                                  <w:rPr>
+                                    <w:color w:val="FFFFFF" w:themeColor="background1"/>
+                                    <w:sz w:val="48"/>
+                                    <w:szCs w:val="48"/>
+                                  </w:rPr>
+                                </w:pPr>
+                                <w:r>
+                                  <w:rPr>
+                                    <w:color w:val="000000" w:themeColor="text1"/>
+                                    <w:sz w:val="48"/>
+                                    <w:szCs w:val="48"/>
+                                  </w:rPr>
+                                  <w:t>PASSWORD</w:t>
+                                </w:r>
+                              </w:p>
+                            </w:txbxContent>
+                          </wps:txbx>
+                          <wps:bodyPr rot="0" spcFirstLastPara="0" vertOverflow="overflow" horzOverflow="overflow" vert="horz" wrap="square" lIns="91440" tIns="45720" rIns="91440" bIns="45720" numCol="1" spcCol="0" rtlCol="0" fromWordArt="0" anchor="t" anchorCtr="0" forceAA="0" compatLnSpc="1">
+                            <a:prstTxWarp prst="textNoShape">
+                              <a:avLst/>
+                            </a:prstTxWarp>
+                            <a:noAutofit/>
+                          </wps:bodyPr>
+                        </wps:wsp>
+                        <wps:wsp>
+                          <wps:cNvPr id="2056983264" name="Rectangle 56"/>
+                          <wps:cNvSpPr/>
+                          <wps:spPr>
+                            <a:xfrm>
+                              <a:off x="3764280" y="1196340"/>
+                              <a:ext cx="2065020" cy="259116"/>
+                            </a:xfrm>
+                            <a:prstGeom prst="rect">
+                              <a:avLst/>
+                            </a:prstGeom>
+                          </wps:spPr>
+                          <wps:style>
+                            <a:lnRef idx="2">
+                              <a:schemeClr val="accent1">
+                                <a:shade val="15000"/>
+                              </a:schemeClr>
+                            </a:lnRef>
+                            <a:fillRef idx="1">
+                              <a:schemeClr val="accent1"/>
+                            </a:fillRef>
+                            <a:effectRef idx="0">
+                              <a:schemeClr val="accent1"/>
+                            </a:effectRef>
+                            <a:fontRef idx="minor">
+                              <a:schemeClr val="lt1"/>
+                            </a:fontRef>
+                          </wps:style>
+                          <wps:bodyPr rot="0" spcFirstLastPara="0" vertOverflow="overflow" horzOverflow="overflow" vert="horz" wrap="square" lIns="91440" tIns="45720" rIns="91440" bIns="45720" numCol="1" spcCol="0" rtlCol="0" fromWordArt="0" anchor="ctr" anchorCtr="0" forceAA="0" compatLnSpc="1">
+                            <a:prstTxWarp prst="textNoShape">
+                              <a:avLst/>
+                            </a:prstTxWarp>
+                            <a:noAutofit/>
+                          </wps:bodyPr>
+                        </wps:wsp>
+                        <wps:wsp>
+                          <wps:cNvPr id="28046739" name="Rectangle 56"/>
+                          <wps:cNvSpPr/>
+                          <wps:spPr>
+                            <a:xfrm>
+                              <a:off x="3764280" y="1607820"/>
+                              <a:ext cx="2065020" cy="259116"/>
+                            </a:xfrm>
+                            <a:prstGeom prst="rect">
+                              <a:avLst/>
+                            </a:prstGeom>
+                          </wps:spPr>
+                          <wps:style>
+                            <a:lnRef idx="2">
+                              <a:schemeClr val="accent1">
+                                <a:shade val="15000"/>
+                              </a:schemeClr>
+                            </a:lnRef>
+                            <a:fillRef idx="1">
+                              <a:schemeClr val="accent1"/>
+                            </a:fillRef>
+                            <a:effectRef idx="0">
+                              <a:schemeClr val="accent1"/>
+                            </a:effectRef>
+                            <a:fontRef idx="minor">
+                              <a:schemeClr val="lt1"/>
+                            </a:fontRef>
+                          </wps:style>
+                          <wps:bodyPr rot="0" spcFirstLastPara="0" vertOverflow="overflow" horzOverflow="overflow" vert="horz" wrap="square" lIns="91440" tIns="45720" rIns="91440" bIns="45720" numCol="1" spcCol="0" rtlCol="0" fromWordArt="0" anchor="ctr" anchorCtr="0" forceAA="0" compatLnSpc="1">
+                            <a:prstTxWarp prst="textNoShape">
+                              <a:avLst/>
+                            </a:prstTxWarp>
+                            <a:noAutofit/>
+                          </wps:bodyPr>
+                        </wps:wsp>
+                      </wpg:grpSp>
                       <wps:wsp>
-                        <wps:cNvPr id="1890597605" name="Text Box 3"/>
+                        <wps:cNvPr id="322528393" name="Text Box 58"/>
                         <wps:cNvSpPr txBox="1"/>
                         <wps:spPr>
                           <a:xfrm>
-                            <a:off x="263236" y="1724890"/>
-                            <a:ext cx="1333500" cy="541020"/>
+                            <a:off x="2049780" y="2087880"/>
+                            <a:ext cx="1045440" cy="403860"/>
                           </a:xfrm>
                           <a:prstGeom prst="rect">
                             <a:avLst/>
                           </a:prstGeom>
                           <a:noFill/>
                           <a:ln w="6350">
-                            <a:noFill/>
+                            <a:solidFill>
+                              <a:prstClr val="black"/>
+                            </a:solidFill>
                           </a:ln>
                         </wps:spPr>
                         <wps:txbx>
@@ -1242,245 +1721,16 @@
                             <w:p>
                               <w:pPr>
                                 <w:rPr>
-                                  <w:color w:val="FFFFFF" w:themeColor="background1"/>
-                                  <w:sz w:val="48"/>
-                                  <w:szCs w:val="48"/>
+                                  <w:sz w:val="44"/>
+                                  <w:szCs w:val="44"/>
                                 </w:rPr>
                               </w:pPr>
                               <w:r>
                                 <w:rPr>
-                                  <w:color w:val="000000" w:themeColor="text1"/>
-                                  <w:sz w:val="48"/>
-                                  <w:szCs w:val="48"/>
+                                  <w:sz w:val="44"/>
+                                  <w:szCs w:val="44"/>
                                 </w:rPr>
-                                <w:t>LOG IN</w:t>
-                              </w:r>
-                            </w:p>
-                          </w:txbxContent>
-                        </wps:txbx>
-                        <wps:bodyPr rot="0" spcFirstLastPara="0" vertOverflow="overflow" horzOverflow="overflow" vert="horz" wrap="square" lIns="91440" tIns="45720" rIns="91440" bIns="45720" numCol="1" spcCol="0" rtlCol="0" fromWordArt="0" anchor="t" anchorCtr="0" forceAA="0" compatLnSpc="1">
-                          <a:prstTxWarp prst="textNoShape">
-                            <a:avLst/>
-                          </a:prstTxWarp>
-                          <a:noAutofit/>
-                        </wps:bodyPr>
-                      </wps:wsp>
-                      <wps:wsp>
-                        <wps:cNvPr id="1689900967" name="Text Box 3"/>
-                        <wps:cNvSpPr txBox="1"/>
-                        <wps:spPr>
-                          <a:xfrm>
-                            <a:off x="131618" y="193963"/>
-                            <a:ext cx="3816927" cy="541020"/>
-                          </a:xfrm>
-                          <a:prstGeom prst="rect">
-                            <a:avLst/>
-                          </a:prstGeom>
-                          <a:noFill/>
-                          <a:ln w="6350">
-                            <a:noFill/>
-                          </a:ln>
-                        </wps:spPr>
-                        <wps:txbx>
-                          <w:txbxContent>
-                            <w:p>
-                              <w:pPr>
-                                <w:rPr>
-                                  <w:rFonts w:ascii="Algerian" w:hAnsi="Algerian"/>
-                                  <w:b/>
-                                  <w:bCs/>
-                                  <w:i/>
-                                  <w:iCs/>
-                                  <w:color w:val="000000" w:themeColor="text1"/>
-                                  <w:sz w:val="36"/>
-                                  <w:szCs w:val="36"/>
-                                  <w:u w:val="single"/>
-                                </w:rPr>
-                              </w:pPr>
-                              <w:r>
-                                <w:rPr>
-                                  <w:rFonts w:ascii="Algerian" w:hAnsi="Algerian"/>
-                                  <w:b/>
-                                  <w:bCs/>
-                                  <w:i/>
-                                  <w:iCs/>
-                                  <w:color w:val="000000" w:themeColor="text1"/>
-                                  <w:sz w:val="36"/>
-                                  <w:szCs w:val="36"/>
-                                  <w:u w:val="single"/>
-                                </w:rPr>
-                                <w:t>WELCOME TO THE SEA OF GAMES</w:t>
-                              </w:r>
-                            </w:p>
-                            <w:p>
-                              <w:pPr>
-                                <w:rPr>
-                                  <w:rFonts w:ascii="Algerian" w:hAnsi="Algerian"/>
-                                  <w:b/>
-                                  <w:bCs/>
-                                  <w:i/>
-                                  <w:iCs/>
-                                  <w:color w:val="000000" w:themeColor="text1"/>
-                                  <w:sz w:val="36"/>
-                                  <w:szCs w:val="36"/>
-                                  <w:u w:val="single"/>
-                                </w:rPr>
-                              </w:pPr>
-                            </w:p>
-                          </w:txbxContent>
-                        </wps:txbx>
-                        <wps:bodyPr rot="0" spcFirstLastPara="0" vertOverflow="overflow" horzOverflow="overflow" vert="horz" wrap="square" lIns="91440" tIns="45720" rIns="91440" bIns="45720" numCol="1" spcCol="0" rtlCol="0" fromWordArt="0" anchor="t" anchorCtr="0" forceAA="0" compatLnSpc="1">
-                          <a:prstTxWarp prst="textNoShape">
-                            <a:avLst/>
-                          </a:prstTxWarp>
-                          <a:noAutofit/>
-                        </wps:bodyPr>
-                      </wps:wsp>
-                      <wps:wsp>
-                        <wps:cNvPr id="594934343" name="Text Box 3"/>
-                        <wps:cNvSpPr txBox="1"/>
-                        <wps:spPr>
-                          <a:xfrm>
-                            <a:off x="2396836" y="1711036"/>
-                            <a:ext cx="1249680" cy="541020"/>
-                          </a:xfrm>
-                          <a:prstGeom prst="rect">
-                            <a:avLst/>
-                          </a:prstGeom>
-                          <a:noFill/>
-                          <a:ln w="6350">
-                            <a:noFill/>
-                          </a:ln>
-                        </wps:spPr>
-                        <wps:txbx>
-                          <w:txbxContent>
-                            <w:p>
-                              <w:pPr>
-                                <w:rPr>
-                                  <w:color w:val="000000" w:themeColor="text1"/>
-                                  <w:sz w:val="48"/>
-                                  <w:szCs w:val="48"/>
-                                </w:rPr>
-                              </w:pPr>
-                              <w:r>
-                                <w:rPr>
-                                  <w:color w:val="000000" w:themeColor="text1"/>
-                                  <w:sz w:val="48"/>
-                                  <w:szCs w:val="48"/>
-                                </w:rPr>
-                                <w:t>SIGN UP</w:t>
-                              </w:r>
-                            </w:p>
-                          </w:txbxContent>
-                        </wps:txbx>
-                        <wps:bodyPr rot="0" spcFirstLastPara="0" vertOverflow="overflow" horzOverflow="overflow" vert="horz" wrap="square" lIns="91440" tIns="45720" rIns="91440" bIns="45720" numCol="1" spcCol="0" rtlCol="0" fromWordArt="0" anchor="t" anchorCtr="0" forceAA="0" compatLnSpc="1">
-                          <a:prstTxWarp prst="textNoShape">
-                            <a:avLst/>
-                          </a:prstTxWarp>
-                          <a:noAutofit/>
-                        </wps:bodyPr>
-                      </wps:wsp>
-                      <wps:wsp>
-                        <wps:cNvPr id="1743322771" name="Text Box 3"/>
-                        <wps:cNvSpPr txBox="1"/>
-                        <wps:spPr>
-                          <a:xfrm>
-                            <a:off x="2407756" y="1381617"/>
-                            <a:ext cx="1569720" cy="342962"/>
-                          </a:xfrm>
-                          <a:prstGeom prst="rect">
-                            <a:avLst/>
-                          </a:prstGeom>
-                          <a:noFill/>
-                          <a:ln w="6350">
-                            <a:noFill/>
-                          </a:ln>
-                        </wps:spPr>
-                        <wps:txbx>
-                          <w:txbxContent>
-                            <w:p>
-                              <w:pPr>
-                                <w:rPr>
-                                  <w:color w:val="FFFFFF" w:themeColor="background1"/>
-                                  <w:sz w:val="18"/>
-                                  <w:szCs w:val="18"/>
-                                  <w14:textOutline w14:w="9525" w14:cap="rnd" w14:cmpd="sng" w14:algn="ctr">
-                                    <w14:noFill/>
-                                    <w14:prstDash w14:val="solid"/>
-                                    <w14:bevel/>
-                                  </w14:textOutline>
-                                </w:rPr>
-                              </w:pPr>
-                              <w:r>
-                                <w:rPr>
-                                  <w:color w:val="000000" w:themeColor="text1"/>
-                                  <w:sz w:val="18"/>
-                                  <w:szCs w:val="18"/>
-                                  <w14:textOutline w14:w="9525" w14:cap="rnd" w14:cmpd="sng" w14:algn="ctr">
-                                    <w14:noFill/>
-                                    <w14:prstDash w14:val="solid"/>
-                                    <w14:bevel/>
-                                  </w14:textOutline>
-                                </w:rPr>
-                                <w:t>NO ACCOUNT?</w:t>
-                              </w:r>
-                            </w:p>
-                          </w:txbxContent>
-                        </wps:txbx>
-                        <wps:bodyPr rot="0" spcFirstLastPara="0" vertOverflow="overflow" horzOverflow="overflow" vert="horz" wrap="square" lIns="91440" tIns="45720" rIns="91440" bIns="45720" numCol="1" spcCol="0" rtlCol="0" fromWordArt="0" anchor="t" anchorCtr="0" forceAA="0" compatLnSpc="1">
-                          <a:prstTxWarp prst="textNoShape">
-                            <a:avLst/>
-                          </a:prstTxWarp>
-                          <a:noAutofit/>
-                        </wps:bodyPr>
-                      </wps:wsp>
-                      <wps:wsp>
-                        <wps:cNvPr id="590011058" name="Text Box 3"/>
-                        <wps:cNvSpPr txBox="1"/>
-                        <wps:spPr>
-                          <a:xfrm>
-                            <a:off x="197106" y="3822083"/>
-                            <a:ext cx="3230880" cy="426618"/>
-                          </a:xfrm>
-                          <a:prstGeom prst="rect">
-                            <a:avLst/>
-                          </a:prstGeom>
-                          <a:noFill/>
-                          <a:ln w="6350">
-                            <a:noFill/>
-                          </a:ln>
-                        </wps:spPr>
-                        <wps:txbx>
-                          <w:txbxContent>
-                            <w:p>
-                              <w:pPr>
-                                <w:rPr>
-                                  <w:color w:val="FFFF00"/>
-                                  <w:sz w:val="20"/>
-                                  <w:szCs w:val="20"/>
-                                  <w14:textOutline w14:w="9525" w14:cap="rnd" w14:cmpd="sng" w14:algn="ctr">
-                                    <w14:solidFill>
-                                      <w14:srgbClr w14:val="000000"/>
-                                    </w14:solidFill>
-                                    <w14:prstDash w14:val="solid"/>
-                                    <w14:bevel/>
-                                  </w14:textOutline>
-                                </w:rPr>
-                              </w:pPr>
-                              <w:r>
-                                <w:rPr>
-                                  <w:color w:val="FFFF00"/>
-                                  <w:sz w:val="20"/>
-                                  <w:szCs w:val="20"/>
-                                  <w14:textOutline w14:w="9525" w14:cap="rnd" w14:cmpd="sng" w14:algn="ctr">
-                                    <w14:solidFill>
-                                      <w14:srgbClr w14:val="000000"/>
-                                    </w14:solidFill>
-                                    <w14:prstDash w14:val="solid"/>
-                                    <w14:bevel/>
-                                  </w14:textOutline>
-                                </w:rPr>
-                                <w:t>TERMS AND CONDITIONS</w:t>
+                                <w:t>LOGIN</w:t>
                               </w:r>
                             </w:p>
                           </w:txbxContent>
@@ -1495,187 +1745,138 @@
                     </wpg:wgp>
                   </a:graphicData>
                 </a:graphic>
-                <wp14:sizeRelH relativeFrom="margin">
-                  <wp14:pctWidth>0</wp14:pctWidth>
-                </wp14:sizeRelH>
-                <wp14:sizeRelV relativeFrom="margin">
-                  <wp14:pctHeight>0</wp14:pctHeight>
-                </wp14:sizeRelV>
               </wp:anchor>
             </w:drawing>
           </mc:Choice>
           <mc:Fallback>
             <w:pict>
-              <v:group w14:anchorId="076FE411" id="Group 4" o:spid="_x0000_s1026" style="position:absolute;margin-left:-34.35pt;margin-top:36.9pt;width:543.25pt;height:252.55pt;z-index:251649024;mso-width-relative:margin;mso-height-relative:margin" coordsize="40767,46177" o:gfxdata="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">
-                <v:roundrect id="Rectangle: Rounded Corners 2" o:spid="_x0000_s1027" style="position:absolute;width:40767;height:46177;visibility:visible;mso-wrap-style:square;v-text-anchor:middle" arcsize="10923f" o:gfxdata="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" fillcolor="#f6f8fc [180]" stroked="f" strokeweight="1pt">
-                  <v:fill color2="#c7d4ed [980]" colors="0 #f6f8fc;48497f #abc0e4;54395f #abc0e4;1 #c7d5ed" focus="100%" type="gradient"/>
-                  <v:stroke joinstyle="miter"/>
-                </v:roundrect>
-                <v:shapetype id="_x0000_t202" coordsize="21600,21600" o:spt="202" path="m,l,21600r21600,l21600,xe">
-                  <v:stroke joinstyle="miter"/>
-                  <v:path gradientshapeok="t" o:connecttype="rect"/>
-                </v:shapetype>
-                <v:shape id="Text Box 3" o:spid="_x0000_s1028" type="#_x0000_t202" style="position:absolute;left:2632;top:17248;width:13335;height:5411;visibility:visible;mso-wrap-style:square;v-text-anchor:top" o:gfxdata="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" filled="f" stroked="f" strokeweight=".5pt">
+              <v:group w14:anchorId="4944A436" id="Group 59" o:spid="_x0000_s1026" style="position:absolute;margin-left:-34.2pt;margin-top:6.35pt;width:543.25pt;height:252.5pt;z-index:251738112" coordsize="68992,32067" o:gfxdata="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">
+                <v:group id="Group 57" o:spid="_x0000_s1027" style="position:absolute;width:68992;height:32067" coordsize="68992,32067" o:gfxdata="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">
+                  <v:group id="Group 4" o:spid="_x0000_s1028" style="position:absolute;width:68992;height:32067" coordsize="40767,46177" o:gfxdata="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">
+                    <v:roundrect id="Rectangle: Rounded Corners 2" o:spid="_x0000_s1029" style="position:absolute;width:40767;height:46177;visibility:visible;mso-wrap-style:square;v-text-anchor:middle" arcsize="10923f" o:gfxdata="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" fillcolor="#f6f8fc [180]" stroked="f" strokeweight="1pt">
+                      <v:fill color2="#c7d4ed [980]" colors="0 #f6f8fc;48497f #abc0e4;54395f #abc0e4;1 #c7d5ed" focus="100%" type="gradient"/>
+                      <v:stroke joinstyle="miter"/>
+                    </v:roundrect>
+                    <v:shapetype id="_x0000_t202" coordsize="21600,21600" o:spt="202" path="m,l,21600r21600,l21600,xe">
+                      <v:stroke joinstyle="miter"/>
+                      <v:path gradientshapeok="t" o:connecttype="rect"/>
+                    </v:shapetype>
+                    <v:shape id="Text Box 3" o:spid="_x0000_s1030" type="#_x0000_t202" style="position:absolute;left:11867;top:15548;width:10150;height:5410;visibility:visible;mso-wrap-style:square;v-text-anchor:top" o:gfxdata="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" filled="f" stroked="f" strokeweight=".5pt">
+                      <v:textbox>
+                        <w:txbxContent>
+                          <w:p>
+                            <w:pPr>
+                              <w:rPr>
+                                <w:color w:val="FFFFFF" w:themeColor="background1"/>
+                                <w:sz w:val="48"/>
+                                <w:szCs w:val="48"/>
+                              </w:rPr>
+                            </w:pPr>
+                            <w:r>
+                              <w:rPr>
+                                <w:color w:val="000000" w:themeColor="text1"/>
+                                <w:sz w:val="48"/>
+                                <w:szCs w:val="48"/>
+                              </w:rPr>
+                              <w:t>USERNAME</w:t>
+                            </w:r>
+                          </w:p>
+                        </w:txbxContent>
+                      </v:textbox>
+                    </v:shape>
+                    <v:shape id="Text Box 3" o:spid="_x0000_s1031" type="#_x0000_t202" style="position:absolute;left:6577;top:4241;width:25076;height:5411;visibility:visible;mso-wrap-style:square;v-text-anchor:top" o:gfxdata="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" filled="f" stroked="f" strokeweight=".5pt">
+                      <v:textbox>
+                        <w:txbxContent>
+                          <w:p>
+                            <w:pPr>
+                              <w:rPr>
+                                <w:rFonts w:ascii="Algerian" w:hAnsi="Algerian"/>
+                                <w:b/>
+                                <w:bCs/>
+                                <w:i/>
+                                <w:iCs/>
+                                <w:color w:val="000000" w:themeColor="text1"/>
+                                <w:sz w:val="36"/>
+                                <w:szCs w:val="36"/>
+                                <w:u w:val="single"/>
+                              </w:rPr>
+                            </w:pPr>
+                            <w:r>
+                              <w:rPr>
+                                <w:rFonts w:ascii="Algerian" w:hAnsi="Algerian"/>
+                                <w:b/>
+                                <w:bCs/>
+                                <w:i/>
+                                <w:iCs/>
+                                <w:color w:val="000000" w:themeColor="text1"/>
+                                <w:sz w:val="36"/>
+                                <w:szCs w:val="36"/>
+                                <w:u w:val="single"/>
+                              </w:rPr>
+                              <w:t>WELCOME TO THE SEA OF GAMES</w:t>
+                            </w:r>
+                          </w:p>
+                          <w:p>
+                            <w:pPr>
+                              <w:rPr>
+                                <w:rFonts w:ascii="Algerian" w:hAnsi="Algerian"/>
+                                <w:b/>
+                                <w:bCs/>
+                                <w:i/>
+                                <w:iCs/>
+                                <w:color w:val="000000" w:themeColor="text1"/>
+                                <w:sz w:val="36"/>
+                                <w:szCs w:val="36"/>
+                                <w:u w:val="single"/>
+                              </w:rPr>
+                            </w:pPr>
+                          </w:p>
+                        </w:txbxContent>
+                      </v:textbox>
+                    </v:shape>
+                  </v:group>
+                  <v:shape id="Text Box 3" o:spid="_x0000_s1032" type="#_x0000_t202" style="position:absolute;left:20084;top:15110;width:16459;height:3757;visibility:visible;mso-wrap-style:square;v-text-anchor:top" o:gfxdata="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" filled="f" stroked="f" strokeweight=".5pt">
+                    <v:textbox>
+                      <w:txbxContent>
+                        <w:p>
+                          <w:pPr>
+                            <w:rPr>
+                              <w:color w:val="FFFFFF" w:themeColor="background1"/>
+                              <w:sz w:val="48"/>
+                              <w:szCs w:val="48"/>
+                            </w:rPr>
+                          </w:pPr>
+                          <w:r>
+                            <w:rPr>
+                              <w:color w:val="000000" w:themeColor="text1"/>
+                              <w:sz w:val="48"/>
+                              <w:szCs w:val="48"/>
+                            </w:rPr>
+                            <w:t>PASSWORD</w:t>
+                          </w:r>
+                        </w:p>
+                      </w:txbxContent>
+                    </v:textbox>
+                  </v:shape>
+                  <v:rect id="Rectangle 56" o:spid="_x0000_s1033" style="position:absolute;left:37642;top:11963;width:20651;height:2591;visibility:visible;mso-wrap-style:square;v-text-anchor:middle" o:gfxdata="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" fillcolor="#4472c4 [3204]" strokecolor="#09101d [484]" strokeweight="1pt"/>
+                  <v:rect id="Rectangle 56" o:spid="_x0000_s1034" style="position:absolute;left:37642;top:16078;width:20651;height:2591;visibility:visible;mso-wrap-style:square;v-text-anchor:middle" o:gfxdata="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" fillcolor="#4472c4 [3204]" strokecolor="#09101d [484]" strokeweight="1pt"/>
+                </v:group>
+                <v:shape id="Text Box 58" o:spid="_x0000_s1035" type="#_x0000_t202" style="position:absolute;left:20497;top:20878;width:10455;height:4039;visibility:visible;mso-wrap-style:square;v-text-anchor:top" o:gfxdata="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" filled="f" strokeweight=".5pt">
                   <v:textbox>
                     <w:txbxContent>
                       <w:p>
                         <w:pPr>
                           <w:rPr>
-                            <w:color w:val="FFFFFF" w:themeColor="background1"/>
-                            <w:sz w:val="48"/>
-                            <w:szCs w:val="48"/>
+                            <w:sz w:val="44"/>
+                            <w:szCs w:val="44"/>
                           </w:rPr>
                         </w:pPr>
                         <w:r>
                           <w:rPr>
-                            <w:color w:val="000000" w:themeColor="text1"/>
-                            <w:sz w:val="48"/>
-                            <w:szCs w:val="48"/>
+                            <w:sz w:val="44"/>
+                            <w:szCs w:val="44"/>
                           </w:rPr>
-                          <w:t>LOG IN</w:t>
-                        </w:r>
-                      </w:p>
-                    </w:txbxContent>
-                  </v:textbox>
-                </v:shape>
-                <v:shape id="Text Box 3" o:spid="_x0000_s1029" type="#_x0000_t202" style="position:absolute;left:1316;top:1939;width:38169;height:5410;visibility:visible;mso-wrap-style:square;v-text-anchor:top" o:gfxdata="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" filled="f" stroked="f" strokeweight=".5pt">
-                  <v:textbox>
-                    <w:txbxContent>
-                      <w:p>
-                        <w:pPr>
-                          <w:rPr>
-                            <w:rFonts w:ascii="Algerian" w:hAnsi="Algerian"/>
-                            <w:b/>
-                            <w:bCs/>
-                            <w:i/>
-                            <w:iCs/>
-                            <w:color w:val="000000" w:themeColor="text1"/>
-                            <w:sz w:val="36"/>
-                            <w:szCs w:val="36"/>
-                            <w:u w:val="single"/>
-                          </w:rPr>
-                        </w:pPr>
-                        <w:r>
-                          <w:rPr>
-                            <w:rFonts w:ascii="Algerian" w:hAnsi="Algerian"/>
-                            <w:b/>
-                            <w:bCs/>
-                            <w:i/>
-                            <w:iCs/>
-                            <w:color w:val="000000" w:themeColor="text1"/>
-                            <w:sz w:val="36"/>
-                            <w:szCs w:val="36"/>
-                            <w:u w:val="single"/>
-                          </w:rPr>
-                          <w:t>WELCOME TO THE SEA OF GAMES</w:t>
-                        </w:r>
-                      </w:p>
-                      <w:p>
-                        <w:pPr>
-                          <w:rPr>
-                            <w:rFonts w:ascii="Algerian" w:hAnsi="Algerian"/>
-                            <w:b/>
-                            <w:bCs/>
-                            <w:i/>
-                            <w:iCs/>
-                            <w:color w:val="000000" w:themeColor="text1"/>
-                            <w:sz w:val="36"/>
-                            <w:szCs w:val="36"/>
-                            <w:u w:val="single"/>
-                          </w:rPr>
-                        </w:pPr>
-                      </w:p>
-                    </w:txbxContent>
-                  </v:textbox>
-                </v:shape>
-                <v:shape id="Text Box 3" o:spid="_x0000_s1030" type="#_x0000_t202" style="position:absolute;left:23968;top:17110;width:12497;height:5410;visibility:visible;mso-wrap-style:square;v-text-anchor:top" o:gfxdata="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" filled="f" stroked="f" strokeweight=".5pt">
-                  <v:textbox>
-                    <w:txbxContent>
-                      <w:p>
-                        <w:pPr>
-                          <w:rPr>
-                            <w:color w:val="000000" w:themeColor="text1"/>
-                            <w:sz w:val="48"/>
-                            <w:szCs w:val="48"/>
-                          </w:rPr>
-                        </w:pPr>
-                        <w:r>
-                          <w:rPr>
-                            <w:color w:val="000000" w:themeColor="text1"/>
-                            <w:sz w:val="48"/>
-                            <w:szCs w:val="48"/>
-                          </w:rPr>
-                          <w:t>SIGN UP</w:t>
-                        </w:r>
-                      </w:p>
-                    </w:txbxContent>
-                  </v:textbox>
-                </v:shape>
-                <v:shape id="Text Box 3" o:spid="_x0000_s1031" type="#_x0000_t202" style="position:absolute;left:24077;top:13816;width:15697;height:3429;visibility:visible;mso-wrap-style:square;v-text-anchor:top" o:gfxdata="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" filled="f" stroked="f" strokeweight=".5pt">
-                  <v:textbox>
-                    <w:txbxContent>
-                      <w:p>
-                        <w:pPr>
-                          <w:rPr>
-                            <w:color w:val="FFFFFF" w:themeColor="background1"/>
-                            <w:sz w:val="18"/>
-                            <w:szCs w:val="18"/>
-                            <w14:textOutline w14:w="9525" w14:cap="rnd" w14:cmpd="sng" w14:algn="ctr">
-                              <w14:noFill/>
-                              <w14:prstDash w14:val="solid"/>
-                              <w14:bevel/>
-                            </w14:textOutline>
-                          </w:rPr>
-                        </w:pPr>
-                        <w:r>
-                          <w:rPr>
-                            <w:color w:val="000000" w:themeColor="text1"/>
-                            <w:sz w:val="18"/>
-                            <w:szCs w:val="18"/>
-                            <w14:textOutline w14:w="9525" w14:cap="rnd" w14:cmpd="sng" w14:algn="ctr">
-                              <w14:noFill/>
-                              <w14:prstDash w14:val="solid"/>
-                              <w14:bevel/>
-                            </w14:textOutline>
-                          </w:rPr>
-                          <w:t>NO ACCOUNT?</w:t>
-                        </w:r>
-                      </w:p>
-                    </w:txbxContent>
-                  </v:textbox>
-                </v:shape>
-                <v:shape id="Text Box 3" o:spid="_x0000_s1032" type="#_x0000_t202" style="position:absolute;left:1971;top:38220;width:32308;height:4267;visibility:visible;mso-wrap-style:square;v-text-anchor:top" o:gfxdata="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" filled="f" stroked="f" strokeweight=".5pt">
-                  <v:textbox>
-                    <w:txbxContent>
-                      <w:p>
-                        <w:pPr>
-                          <w:rPr>
-                            <w:color w:val="FFFF00"/>
-                            <w:sz w:val="20"/>
-                            <w:szCs w:val="20"/>
-                            <w14:textOutline w14:w="9525" w14:cap="rnd" w14:cmpd="sng" w14:algn="ctr">
-                              <w14:solidFill>
-                                <w14:srgbClr w14:val="000000"/>
-                              </w14:solidFill>
-                              <w14:prstDash w14:val="solid"/>
-                              <w14:bevel/>
-                            </w14:textOutline>
-                          </w:rPr>
-                        </w:pPr>
-                        <w:r>
-                          <w:rPr>
-                            <w:color w:val="FFFF00"/>
-                            <w:sz w:val="20"/>
-                            <w:szCs w:val="20"/>
-                            <w14:textOutline w14:w="9525" w14:cap="rnd" w14:cmpd="sng" w14:algn="ctr">
-                              <w14:solidFill>
-                                <w14:srgbClr w14:val="000000"/>
-                              </w14:solidFill>
-                              <w14:prstDash w14:val="solid"/>
-                              <w14:bevel/>
-                            </w14:textOutline>
-                          </w:rPr>
-                          <w:t>TERMS AND CONDITIONS</w:t>
+                          <w:t>LOGIN</w:t>
                         </w:r>
                       </w:p>
                     </w:txbxContent>
@@ -1686,10 +1887,6 @@
           </mc:Fallback>
         </mc:AlternateContent>
       </w:r>
-      <w:r>
-        <w:t>TITLE: USER INTERFACEE PLANNING AND SYSTEM DESIGN</w:t>
-      </w:r>
-      <w:bookmarkEnd w:id="4"/>
     </w:p>
     <w:p/>
     <w:p/>
@@ -1700,7 +1897,6 @@
     <w:p/>
     <w:p/>
     <w:p/>
-    <w:p/>
     <w:p>
       <w:r>
         <w:rPr>
@@ -1709,7 +1905,7 @@
         <mc:AlternateContent>
           <mc:Choice Requires="wps">
             <w:drawing>
-              <wp:anchor distT="0" distB="0" distL="114300" distR="114300" simplePos="0" relativeHeight="251651072" behindDoc="0" locked="0" layoutInCell="1" allowOverlap="1" wp14:anchorId="192EF56F" wp14:editId="46BC920B">
+              <wp:anchor distT="0" distB="0" distL="114300" distR="114300" simplePos="0" relativeHeight="251649024" behindDoc="0" locked="0" layoutInCell="1" allowOverlap="1" wp14:anchorId="192EF56F" wp14:editId="228AEBE7">
                 <wp:simplePos x="0" y="0"/>
                 <wp:positionH relativeFrom="column">
                   <wp:posOffset>54956</wp:posOffset>
@@ -1776,7 +1972,7 @@
           </mc:Choice>
           <mc:Fallback>
             <w:pict>
-              <v:shape w14:anchorId="192EF56F" id="Text Box 1" o:spid="_x0000_s1033" type="#_x0000_t202" style="position:absolute;margin-left:4.35pt;margin-top:17.75pt;width:321pt;height:.05pt;z-index:251651072;visibility:visible;mso-wrap-style:square;mso-wrap-distance-left:9pt;mso-wrap-distance-top:0;mso-wrap-distance-right:9pt;mso-wrap-distance-bottom:0;mso-position-horizontal:absolute;mso-position-horizontal-relative:text;mso-position-vertical:absolute;mso-position-vertical-relative:text;v-text-anchor:top" o:gfxdata="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" filled="f" stroked="f">
+              <v:shape w14:anchorId="192EF56F" id="Text Box 1" o:spid="_x0000_s1036" type="#_x0000_t202" style="position:absolute;margin-left:4.35pt;margin-top:17.75pt;width:321pt;height:.05pt;z-index:251649024;visibility:visible;mso-wrap-style:square;mso-wrap-distance-left:9pt;mso-wrap-distance-top:0;mso-wrap-distance-right:9pt;mso-wrap-distance-bottom:0;mso-position-horizontal:absolute;mso-position-horizontal-relative:text;mso-position-vertical:absolute;mso-position-vertical-relative:text;v-text-anchor:top" o:gfxdata="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" filled="f" stroked="f">
                 <v:textbox style="mso-fit-shape-to-text:t" inset="0,0,0,0">
                   <w:txbxContent>
                     <w:p>
@@ -1814,7 +2010,7 @@
         <mc:AlternateContent>
           <mc:Choice Requires="wpg">
             <w:drawing>
-              <wp:anchor distT="0" distB="0" distL="114300" distR="114300" simplePos="0" relativeHeight="251696128" behindDoc="0" locked="0" layoutInCell="1" allowOverlap="1" wp14:anchorId="5EFFD7A7" wp14:editId="4B3B9B11">
+              <wp:anchor distT="0" distB="0" distL="114300" distR="114300" simplePos="0" relativeHeight="251694080" behindDoc="0" locked="0" layoutInCell="1" allowOverlap="1" wp14:anchorId="5EFFD7A7" wp14:editId="4688D1E3">
                 <wp:simplePos x="0" y="0"/>
                 <wp:positionH relativeFrom="margin">
                   <wp:align>center</wp:align>
@@ -3068,21 +3264,21 @@
           </mc:Choice>
           <mc:Fallback>
             <w:pict>
-              <v:group w14:anchorId="5EFFD7A7" id="Group 28" o:spid="_x0000_s1034" style="position:absolute;margin-left:0;margin-top:10.8pt;width:530.75pt;height:257.4pt;z-index:251696128;mso-position-horizontal:center;mso-position-horizontal-relative:margin;mso-width-relative:margin;mso-height-relative:margin" coordsize="70307,37615" o:gfxdata="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">
-                <v:roundrect id="Rectangle: Rounded Corners 7" o:spid="_x0000_s1035" style="position:absolute;width:70307;height:37615;visibility:visible;mso-wrap-style:square;v-text-anchor:middle" arcsize="10923f" o:gfxdata="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" filled="f" strokecolor="#09101d [484]" strokeweight="1pt">
+              <v:group w14:anchorId="5EFFD7A7" id="Group 28" o:spid="_x0000_s1037" style="position:absolute;margin-left:0;margin-top:10.8pt;width:530.75pt;height:257.4pt;z-index:251694080;mso-position-horizontal:center;mso-position-horizontal-relative:margin;mso-width-relative:margin;mso-height-relative:margin" coordsize="70307,37615" o:gfxdata="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">
+                <v:roundrect id="Rectangle: Rounded Corners 7" o:spid="_x0000_s1038" style="position:absolute;width:70307;height:37615;visibility:visible;mso-wrap-style:square;v-text-anchor:middle" arcsize="10923f" o:gfxdata="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" filled="f" strokecolor="#09101d [484]" strokeweight="1pt">
                   <v:stroke joinstyle="miter"/>
                 </v:roundrect>
-                <v:group id="Group 27" o:spid="_x0000_s1036" style="position:absolute;left:2424;top:484;width:61439;height:34013" coordsize="61439,34012" o:gfxdata="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">
-                  <v:group id="Group 26" o:spid="_x0000_s1037" style="position:absolute;top:3810;width:10529;height:30202" coordsize="10529,30202" o:gfxdata="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">
-                    <v:roundrect id="Rectangle: Rounded Corners 25" o:spid="_x0000_s1038" style="position:absolute;width:10529;height:30202;visibility:visible;mso-wrap-style:square;v-text-anchor:middle" arcsize="10923f" o:gfxdata="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" fillcolor="#f6f8fc [180]" strokecolor="#09101d [484]" strokeweight="1pt">
+                <v:group id="Group 27" o:spid="_x0000_s1039" style="position:absolute;left:2424;top:484;width:61439;height:34013" coordsize="61439,34012" o:gfxdata="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">
+                  <v:group id="Group 26" o:spid="_x0000_s1040" style="position:absolute;top:3810;width:10529;height:30202" coordsize="10529,30202" o:gfxdata="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">
+                    <v:roundrect id="Rectangle: Rounded Corners 25" o:spid="_x0000_s1041" style="position:absolute;width:10529;height:30202;visibility:visible;mso-wrap-style:square;v-text-anchor:middle" arcsize="10923f" o:gfxdata="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" fillcolor="#f6f8fc [180]" strokecolor="#09101d [484]" strokeweight="1pt">
                       <v:fill color2="#c7d4ed [980]" colors="0 #f6f8fc;48497f #abc0e4;54395f #abc0e4;1 #c7d5ed" focus="100%" type="gradient"/>
                       <v:stroke joinstyle="miter"/>
                     </v:roundrect>
-                    <v:oval id="Oval 8" o:spid="_x0000_s1039" style="position:absolute;left:415;top:623;width:3924;height:3651;visibility:visible;mso-wrap-style:square;v-text-anchor:middle" o:gfxdata="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" fillcolor="#f6f8fc [180]" strokecolor="#09101d [484]" strokeweight="1pt">
+                    <v:oval id="Oval 8" o:spid="_x0000_s1042" style="position:absolute;left:415;top:623;width:3924;height:3651;visibility:visible;mso-wrap-style:square;v-text-anchor:middle" o:gfxdata="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" fillcolor="#f6f8fc [180]" strokecolor="#09101d [484]" strokeweight="1pt">
                       <v:fill color2="#c7d4ed [980]" colors="0 #f6f8fc;48497f #abc0e4;54395f #abc0e4;1 #c7d5ed" focus="100%" type="gradient"/>
                       <v:stroke joinstyle="miter"/>
                     </v:oval>
-                    <v:rect id="Rectangle 9" o:spid="_x0000_s1040" style="position:absolute;left:4572;top:1246;width:4807;height:2895;visibility:visible;mso-wrap-style:square;v-text-anchor:middle" o:gfxdata="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" filled="f" stroked="f" strokeweight="1pt">
+                    <v:rect id="Rectangle 9" o:spid="_x0000_s1043" style="position:absolute;left:4572;top:1246;width:4807;height:2895;visibility:visible;mso-wrap-style:square;v-text-anchor:middle" o:gfxdata="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" filled="f" stroked="f" strokeweight="1pt">
                       <v:textbox>
                         <w:txbxContent>
                           <w:p>
@@ -3106,7 +3302,7 @@
                         </w:txbxContent>
                       </v:textbox>
                     </v:rect>
-                    <v:rect id="Rectangle 10" o:spid="_x0000_s1041" style="position:absolute;left:69;top:6373;width:4713;height:2268;visibility:visible;mso-wrap-style:square;v-text-anchor:middle" o:gfxdata="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" filled="f" stroked="f" strokeweight="1pt">
+                    <v:rect id="Rectangle 10" o:spid="_x0000_s1044" style="position:absolute;left:69;top:6373;width:4713;height:2268;visibility:visible;mso-wrap-style:square;v-text-anchor:middle" o:gfxdata="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" filled="f" stroked="f" strokeweight="1pt">
                       <v:textbox>
                         <w:txbxContent>
                           <w:p>
@@ -3129,7 +3325,7 @@
                         </w:txbxContent>
                       </v:textbox>
                     </v:rect>
-                    <v:rect id="Rectangle 10" o:spid="_x0000_s1042" style="position:absolute;left:415;top:9836;width:9724;height:2334;visibility:visible;mso-wrap-style:square;v-text-anchor:middle" o:gfxdata="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" filled="f" stroked="f" strokeweight="1pt">
+                    <v:rect id="Rectangle 10" o:spid="_x0000_s1045" style="position:absolute;left:415;top:9836;width:9724;height:2334;visibility:visible;mso-wrap-style:square;v-text-anchor:middle" o:gfxdata="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" filled="f" stroked="f" strokeweight="1pt">
                       <v:textbox>
                         <w:txbxContent>
                           <w:p>
@@ -3152,7 +3348,7 @@
                         </w:txbxContent>
                       </v:textbox>
                     </v:rect>
-                    <v:rect id="Rectangle 10" o:spid="_x0000_s1043" style="position:absolute;left:415;top:13300;width:6369;height:2268;visibility:visible;mso-wrap-style:square;v-text-anchor:middle" o:gfxdata="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" filled="f" stroked="f" strokeweight="1pt">
+                    <v:rect id="Rectangle 10" o:spid="_x0000_s1046" style="position:absolute;left:415;top:13300;width:6369;height:2268;visibility:visible;mso-wrap-style:square;v-text-anchor:middle" o:gfxdata="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" filled="f" stroked="f" strokeweight="1pt">
                       <v:textbox>
                         <w:txbxContent>
                           <w:p>
@@ -3175,7 +3371,7 @@
                         </w:txbxContent>
                       </v:textbox>
                     </v:rect>
-                    <v:rect id="Rectangle 10" o:spid="_x0000_s1044" style="position:absolute;left:415;top:16486;width:5541;height:2265;visibility:visible;mso-wrap-style:square;v-text-anchor:middle" o:gfxdata="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" filled="f" stroked="f" strokeweight="1pt">
+                    <v:rect id="Rectangle 10" o:spid="_x0000_s1047" style="position:absolute;left:415;top:16486;width:5541;height:2265;visibility:visible;mso-wrap-style:square;v-text-anchor:middle" o:gfxdata="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" filled="f" stroked="f" strokeweight="1pt">
                       <v:textbox>
                         <w:txbxContent>
                           <w:p>
@@ -3208,7 +3404,7 @@
                         </w:txbxContent>
                       </v:textbox>
                     </v:rect>
-                    <v:rect id="Rectangle 10" o:spid="_x0000_s1045" style="position:absolute;left:415;top:20019;width:5541;height:2647;visibility:visible;mso-wrap-style:square;v-text-anchor:middle" o:gfxdata="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" filled="f" stroked="f" strokeweight="1pt">
+                    <v:rect id="Rectangle 10" o:spid="_x0000_s1048" style="position:absolute;left:415;top:20019;width:5541;height:2647;visibility:visible;mso-wrap-style:square;v-text-anchor:middle" o:gfxdata="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" filled="f" stroked="f" strokeweight="1pt">
                       <v:textbox>
                         <w:txbxContent>
                           <w:p>
@@ -3241,7 +3437,7 @@
                         </w:txbxContent>
                       </v:textbox>
                     </v:rect>
-                    <v:rect id="Rectangle 10" o:spid="_x0000_s1046" style="position:absolute;left:415;top:26670;width:5100;height:2268;visibility:visible;mso-wrap-style:square;v-text-anchor:middle" o:gfxdata="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" filled="f" stroked="f" strokeweight="1pt">
+                    <v:rect id="Rectangle 10" o:spid="_x0000_s1049" style="position:absolute;left:415;top:26670;width:5100;height:2268;visibility:visible;mso-wrap-style:square;v-text-anchor:middle" o:gfxdata="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" filled="f" stroked="f" strokeweight="1pt">
                       <v:textbox>
                         <w:txbxContent>
                           <w:p>
@@ -3274,7 +3470,7 @@
                         </w:txbxContent>
                       </v:textbox>
                     </v:rect>
-                    <v:rect id="Rectangle 10" o:spid="_x0000_s1047" style="position:absolute;left:415;top:23414;width:5155;height:2268;visibility:visible;mso-wrap-style:square;v-text-anchor:middle" o:gfxdata="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" filled="f" stroked="f" strokeweight="1pt">
+                    <v:rect id="Rectangle 10" o:spid="_x0000_s1050" style="position:absolute;left:415;top:23414;width:5155;height:2268;visibility:visible;mso-wrap-style:square;v-text-anchor:middle" o:gfxdata="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" filled="f" stroked="f" strokeweight="1pt">
                       <v:textbox>
                         <w:txbxContent>
                           <w:p>
@@ -3308,7 +3504,7 @@
                       </v:textbox>
                     </v:rect>
                   </v:group>
-                  <v:shape id="Text Box 13" o:spid="_x0000_s1048" type="#_x0000_t202" style="position:absolute;left:1177;top:346;width:9560;height:2632;visibility:visible;mso-wrap-style:square;v-text-anchor:top" o:gfxdata="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" fillcolor="white [3201]" stroked="f" strokeweight=".5pt">
+                  <v:shape id="Text Box 13" o:spid="_x0000_s1051" type="#_x0000_t202" style="position:absolute;left:1177;top:346;width:9560;height:2632;visibility:visible;mso-wrap-style:square;v-text-anchor:top" o:gfxdata="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" fillcolor="white [3201]" stroked="f" strokeweight=".5pt">
                     <v:textbox>
                       <w:txbxContent>
                         <w:p>
@@ -3329,7 +3525,7 @@
                       </w:txbxContent>
                     </v:textbox>
                   </v:shape>
-                  <v:roundrect id="Rectangle: Rounded Corners 14" o:spid="_x0000_s1049" style="position:absolute;left:18288;width:34004;height:3532;visibility:visible;mso-wrap-style:square;v-text-anchor:middle" arcsize=".5" o:gfxdata="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" filled="f" strokeweight="1pt">
+                  <v:roundrect id="Rectangle: Rounded Corners 14" o:spid="_x0000_s1052" style="position:absolute;left:18288;width:34004;height:3532;visibility:visible;mso-wrap-style:square;v-text-anchor:middle" arcsize=".5" o:gfxdata="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" filled="f" strokeweight="1pt">
                     <v:stroke joinstyle="miter"/>
                     <v:textbox>
                       <w:txbxContent>
@@ -3341,11 +3537,11 @@
                       </w:txbxContent>
                     </v:textbox>
                   </v:roundrect>
-                  <v:roundrect id="Rectangle: Rounded Corners 17" o:spid="_x0000_s1050" style="position:absolute;left:18703;top:6096;width:42736;height:17037;visibility:visible;mso-wrap-style:square;v-text-anchor:middle" arcsize="0" o:gfxdata="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" filled="f" stroked="f" strokeweight="1pt">
+                  <v:roundrect id="Rectangle: Rounded Corners 17" o:spid="_x0000_s1053" style="position:absolute;left:18703;top:6096;width:42736;height:17037;visibility:visible;mso-wrap-style:square;v-text-anchor:middle" arcsize="0" o:gfxdata="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" filled="f" stroked="f" strokeweight="1pt">
                     <v:stroke joinstyle="miter"/>
                   </v:roundrect>
-                  <v:group id="Group 21" o:spid="_x0000_s1051" style="position:absolute;left:40870;top:7065;width:19806;height:4153" coordsize="19805,4152" o:gfxdata="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">
-                    <v:roundrect id="Rectangle: Rounded Corners 18" o:spid="_x0000_s1052" style="position:absolute;width:19805;height:4152;visibility:visible;mso-wrap-style:square;v-text-anchor:middle" arcsize=".5" o:gfxdata="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" filled="f" strokecolor="#09101d [484]" strokeweight="1pt">
+                  <v:group id="Group 21" o:spid="_x0000_s1054" style="position:absolute;left:40870;top:7065;width:19806;height:4153" coordsize="19805,4152" o:gfxdata="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">
+                    <v:roundrect id="Rectangle: Rounded Corners 18" o:spid="_x0000_s1055" style="position:absolute;width:19805;height:4152;visibility:visible;mso-wrap-style:square;v-text-anchor:middle" arcsize=".5" o:gfxdata="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" filled="f" strokecolor="#09101d [484]" strokeweight="1pt">
                       <v:stroke joinstyle="miter"/>
                       <v:textbox>
                         <w:txbxContent>
@@ -3366,12 +3562,12 @@
                         </w:txbxContent>
                       </v:textbox>
                     </v:roundrect>
-                    <v:oval id="Oval 19" o:spid="_x0000_s1053" style="position:absolute;left:415;top:415;width:3601;height:3391;visibility:visible;mso-wrap-style:square;v-text-anchor:middle" o:gfxdata="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" fillcolor="#4472c4 [3204]" strokecolor="#09101d [484]" strokeweight="1pt">
+                    <v:oval id="Oval 19" o:spid="_x0000_s1056" style="position:absolute;left:415;top:415;width:3601;height:3391;visibility:visible;mso-wrap-style:square;v-text-anchor:middle" o:gfxdata="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" fillcolor="#4472c4 [3204]" strokecolor="#09101d [484]" strokeweight="1pt">
                       <v:stroke joinstyle="miter"/>
                     </v:oval>
                   </v:group>
-                  <v:group id="Group 21" o:spid="_x0000_s1054" style="position:absolute;left:40593;top:11637;width:19806;height:4153" coordsize="19805,4152" o:gfxdata="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">
-                    <v:roundrect id="Rectangle: Rounded Corners 18" o:spid="_x0000_s1055" style="position:absolute;width:19805;height:4152;visibility:visible;mso-wrap-style:square;v-text-anchor:middle" arcsize=".5" o:gfxdata="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" filled="f" strokecolor="#09101d [484]" strokeweight="1pt">
+                  <v:group id="Group 21" o:spid="_x0000_s1057" style="position:absolute;left:40593;top:11637;width:19806;height:4153" coordsize="19805,4152" o:gfxdata="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">
+                    <v:roundrect id="Rectangle: Rounded Corners 18" o:spid="_x0000_s1058" style="position:absolute;width:19805;height:4152;visibility:visible;mso-wrap-style:square;v-text-anchor:middle" arcsize=".5" o:gfxdata="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" filled="f" strokecolor="#09101d [484]" strokeweight="1pt">
                       <v:stroke joinstyle="miter"/>
                       <v:textbox>
                         <w:txbxContent>
@@ -3392,12 +3588,12 @@
                         </w:txbxContent>
                       </v:textbox>
                     </v:roundrect>
-                    <v:oval id="Oval 19" o:spid="_x0000_s1056" style="position:absolute;left:415;top:415;width:3601;height:3391;visibility:visible;mso-wrap-style:square;v-text-anchor:middle" o:gfxdata="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" fillcolor="#4472c4 [3204]" strokecolor="#09101d [484]" strokeweight="1pt">
+                    <v:oval id="Oval 19" o:spid="_x0000_s1059" style="position:absolute;left:415;top:415;width:3601;height:3391;visibility:visible;mso-wrap-style:square;v-text-anchor:middle" o:gfxdata="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" fillcolor="#4472c4 [3204]" strokecolor="#09101d [484]" strokeweight="1pt">
                       <v:stroke joinstyle="miter"/>
                     </v:oval>
                   </v:group>
-                  <v:group id="Group 21" o:spid="_x0000_s1057" style="position:absolute;left:40807;top:16279;width:19806;height:4152" coordorigin="144" coordsize="19805,4152" o:gfxdata="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">
-                    <v:roundrect id="Rectangle: Rounded Corners 18" o:spid="_x0000_s1058" style="position:absolute;left:144;width:19806;height:4152;visibility:visible;mso-wrap-style:square;v-text-anchor:middle" arcsize=".5" o:gfxdata="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" filled="f" strokecolor="#09101d [484]" strokeweight="1pt">
+                  <v:group id="Group 21" o:spid="_x0000_s1060" style="position:absolute;left:40807;top:16279;width:19806;height:4152" coordorigin="144" coordsize="19805,4152" o:gfxdata="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">
+                    <v:roundrect id="Rectangle: Rounded Corners 18" o:spid="_x0000_s1061" style="position:absolute;left:144;width:19806;height:4152;visibility:visible;mso-wrap-style:square;v-text-anchor:middle" arcsize=".5" o:gfxdata="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" filled="f" strokecolor="#09101d [484]" strokeweight="1pt">
                       <v:stroke joinstyle="miter"/>
                       <v:textbox>
                         <w:txbxContent>
@@ -3418,11 +3614,11 @@
                         </w:txbxContent>
                       </v:textbox>
                     </v:roundrect>
-                    <v:oval id="Oval 19" o:spid="_x0000_s1059" style="position:absolute;left:415;top:415;width:3601;height:3391;visibility:visible;mso-wrap-style:square;v-text-anchor:middle" o:gfxdata="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" fillcolor="#4472c4 [3204]" strokecolor="#09101d [484]" strokeweight="1pt">
+                    <v:oval id="Oval 19" o:spid="_x0000_s1062" style="position:absolute;left:415;top:415;width:3601;height:3391;visibility:visible;mso-wrap-style:square;v-text-anchor:middle" o:gfxdata="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" fillcolor="#4472c4 [3204]" strokecolor="#09101d [484]" strokeweight="1pt">
                       <v:stroke joinstyle="miter"/>
                     </v:oval>
                   </v:group>
-                  <v:shape id="Text Box 24" o:spid="_x0000_s1060" type="#_x0000_t202" style="position:absolute;left:19396;top:484;width:6996;height:2702;visibility:visible;mso-wrap-style:square;v-text-anchor:top" o:gfxdata="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" fillcolor="white [3201]" stroked="f" strokeweight=".5pt">
+                  <v:shape id="Text Box 24" o:spid="_x0000_s1063" type="#_x0000_t202" style="position:absolute;left:19396;top:484;width:6996;height:2702;visibility:visible;mso-wrap-style:square;v-text-anchor:top" o:gfxdata="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" fillcolor="white [3201]" stroked="f" strokeweight=".5pt">
                     <v:textbox>
                       <w:txbxContent>
                         <w:p>
@@ -3447,7 +3643,7 @@
         <mc:AlternateContent>
           <mc:Choice Requires="wps">
             <w:drawing>
-              <wp:anchor distT="0" distB="0" distL="114300" distR="114300" simplePos="0" relativeHeight="251698176" behindDoc="0" locked="0" layoutInCell="1" allowOverlap="1" wp14:anchorId="6A74B017" wp14:editId="48B8CAAB">
+              <wp:anchor distT="0" distB="0" distL="114300" distR="114300" simplePos="0" relativeHeight="251696128" behindDoc="0" locked="0" layoutInCell="1" allowOverlap="1" wp14:anchorId="6A74B017" wp14:editId="09E8CA8F">
                 <wp:simplePos x="0" y="0"/>
                 <wp:positionH relativeFrom="column">
                   <wp:posOffset>-409575</wp:posOffset>
@@ -3519,7 +3715,7 @@
           </mc:Choice>
           <mc:Fallback>
             <w:pict>
-              <v:shape w14:anchorId="6A74B017" id="_x0000_s1061" type="#_x0000_t202" style="position:absolute;margin-left:-32.25pt;margin-top:272.7pt;width:530.7pt;height:.05pt;z-index:251698176;visibility:visible;mso-wrap-style:square;mso-wrap-distance-left:9pt;mso-wrap-distance-top:0;mso-wrap-distance-right:9pt;mso-wrap-distance-bottom:0;mso-position-horizontal:absolute;mso-position-horizontal-relative:text;mso-position-vertical:absolute;mso-position-vertical-relative:text;v-text-anchor:top" o:gfxdata="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" stroked="f">
+              <v:shape w14:anchorId="6A74B017" id="_x0000_s1064" type="#_x0000_t202" style="position:absolute;margin-left:-32.25pt;margin-top:272.7pt;width:530.7pt;height:.05pt;z-index:251696128;visibility:visible;mso-wrap-style:square;mso-wrap-distance-left:9pt;mso-wrap-distance-top:0;mso-wrap-distance-right:9pt;mso-wrap-distance-bottom:0;mso-position-horizontal:absolute;mso-position-horizontal-relative:text;mso-position-vertical:absolute;mso-position-vertical-relative:text;v-text-anchor:top" o:gfxdata="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" stroked="f">
                 <v:textbox style="mso-fit-shape-to-text:t" inset="0,0,0,0">
                   <w:txbxContent>
                     <w:p>
@@ -3586,7 +3782,7 @@
         <mc:AlternateContent>
           <mc:Choice Requires="wps">
             <w:drawing>
-              <wp:anchor distT="0" distB="0" distL="114300" distR="114300" simplePos="0" relativeHeight="251702272" behindDoc="0" locked="0" layoutInCell="1" allowOverlap="1" wp14:anchorId="3A9717B7" wp14:editId="615F4895">
+              <wp:anchor distT="0" distB="0" distL="114300" distR="114300" simplePos="0" relativeHeight="251700224" behindDoc="0" locked="0" layoutInCell="1" allowOverlap="1" wp14:anchorId="3A9717B7" wp14:editId="42AF824D">
                 <wp:simplePos x="0" y="0"/>
                 <wp:positionH relativeFrom="column">
                   <wp:posOffset>925253</wp:posOffset>
@@ -3651,7 +3847,7 @@
           </mc:Choice>
           <mc:Fallback>
             <w:pict>
-              <v:shape w14:anchorId="22411D7C" id="Minus Sign 33" o:spid="_x0000_s1026" style="position:absolute;margin-left:72.85pt;margin-top:14.65pt;width:32.15pt;height:19.05pt;z-index:251702272;visibility:visible;mso-wrap-style:square;mso-width-percent:0;mso-height-percent:0;mso-wrap-distance-left:9pt;mso-wrap-distance-top:0;mso-wrap-distance-right:9pt;mso-wrap-distance-bottom:0;mso-position-horizontal:absolute;mso-position-horizontal-relative:text;mso-position-vertical:absolute;mso-position-vertical-relative:text;mso-width-percent:0;mso-height-percent:0;mso-width-relative:margin;mso-height-relative:margin;v-text-anchor:middle" coordsize="408305,241935" o:gfxdata="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" path="m54121,92516r300063,l354184,149419r-300063,l54121,92516xe" fillcolor="black [3213]" strokecolor="#09101d [484]" strokeweight="1pt">
+              <v:shape w14:anchorId="68A637FA" id="Minus Sign 33" o:spid="_x0000_s1026" style="position:absolute;margin-left:72.85pt;margin-top:14.65pt;width:32.15pt;height:19.05pt;z-index:251700224;visibility:visible;mso-wrap-style:square;mso-width-percent:0;mso-height-percent:0;mso-wrap-distance-left:9pt;mso-wrap-distance-top:0;mso-wrap-distance-right:9pt;mso-wrap-distance-bottom:0;mso-position-horizontal:absolute;mso-position-horizontal-relative:text;mso-position-vertical:absolute;mso-position-vertical-relative:text;mso-width-percent:0;mso-height-percent:0;mso-width-relative:margin;mso-height-relative:margin;v-text-anchor:middle" coordsize="408305,241935" o:gfxdata="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" path="m54121,92516r300063,l354184,149419r-300063,l54121,92516xe" fillcolor="black [3213]" strokecolor="#09101d [484]" strokeweight="1pt">
                 <v:stroke joinstyle="miter"/>
                 <v:path arrowok="t" o:connecttype="custom" o:connectlocs="54121,92516;354184,92516;354184,149419;54121,149419;54121,92516" o:connectangles="0,0,0,0,0"/>
               </v:shape>
@@ -3666,7 +3862,7 @@
         <mc:AlternateContent>
           <mc:Choice Requires="wps">
             <w:drawing>
-              <wp:anchor distT="0" distB="0" distL="114300" distR="114300" simplePos="0" relativeHeight="251731968" behindDoc="0" locked="0" layoutInCell="1" allowOverlap="1" wp14:anchorId="79376F1E" wp14:editId="4717041A">
+              <wp:anchor distT="0" distB="0" distL="114300" distR="114300" simplePos="0" relativeHeight="251729920" behindDoc="0" locked="0" layoutInCell="1" allowOverlap="1" wp14:anchorId="79376F1E" wp14:editId="7EDD0218">
                 <wp:simplePos x="0" y="0"/>
                 <wp:positionH relativeFrom="column">
                   <wp:posOffset>616123</wp:posOffset>
@@ -3738,7 +3934,7 @@
           </mc:Choice>
           <mc:Fallback>
             <w:pict>
-              <v:shape w14:anchorId="79376F1E" id="_x0000_s1062" type="#_x0000_t202" style="position:absolute;margin-left:48.5pt;margin-top:432.65pt;width:321.8pt;height:.05pt;z-index:251731968;visibility:visible;mso-wrap-style:square;mso-wrap-distance-left:9pt;mso-wrap-distance-top:0;mso-wrap-distance-right:9pt;mso-wrap-distance-bottom:0;mso-position-horizontal:absolute;mso-position-horizontal-relative:text;mso-position-vertical:absolute;mso-position-vertical-relative:text;v-text-anchor:top" o:gfxdata="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" stroked="f">
+              <v:shape w14:anchorId="79376F1E" id="_x0000_s1065" type="#_x0000_t202" style="position:absolute;margin-left:48.5pt;margin-top:432.65pt;width:321.8pt;height:.05pt;z-index:251729920;visibility:visible;mso-wrap-style:square;mso-wrap-distance-left:9pt;mso-wrap-distance-top:0;mso-wrap-distance-right:9pt;mso-wrap-distance-bottom:0;mso-position-horizontal:absolute;mso-position-horizontal-relative:text;mso-position-vertical:absolute;mso-position-vertical-relative:text;v-text-anchor:top" o:gfxdata="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" stroked="f">
                 <v:textbox style="mso-fit-shape-to-text:t" inset="0,0,0,0">
                   <w:txbxContent>
                     <w:p>
@@ -3777,7 +3973,7 @@
         <mc:AlternateContent>
           <mc:Choice Requires="wpg">
             <w:drawing>
-              <wp:anchor distT="0" distB="0" distL="114300" distR="114300" simplePos="0" relativeHeight="251729920" behindDoc="0" locked="0" layoutInCell="1" allowOverlap="1" wp14:anchorId="714A5AE6" wp14:editId="252DAF32">
+              <wp:anchor distT="0" distB="0" distL="114300" distR="114300" simplePos="0" relativeHeight="251727872" behindDoc="0" locked="0" layoutInCell="1" allowOverlap="1" wp14:anchorId="714A5AE6" wp14:editId="6226A035">
                 <wp:simplePos x="0" y="0"/>
                 <wp:positionH relativeFrom="column">
                   <wp:posOffset>671542</wp:posOffset>
@@ -4577,19 +4773,19 @@
           </mc:Choice>
           <mc:Fallback>
             <w:pict>
-              <v:group w14:anchorId="714A5AE6" id="Group 42" o:spid="_x0000_s1063" style="position:absolute;margin-left:52.9pt;margin-top:-2.2pt;width:321.8pt;height:430.35pt;z-index:251729920" coordsize="40870,54652" o:gfxdata="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">
-                <v:roundrect id="Rectangle: Rounded Corners 29" o:spid="_x0000_s1064" style="position:absolute;width:40870;height:54652;visibility:visible;mso-wrap-style:square;v-text-anchor:middle" arcsize="10923f" o:gfxdata="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" filled="f" strokecolor="#09101d [484]" strokeweight="1pt">
+              <v:group w14:anchorId="714A5AE6" id="Group 42" o:spid="_x0000_s1066" style="position:absolute;margin-left:52.9pt;margin-top:-2.2pt;width:321.8pt;height:430.35pt;z-index:251727872" coordsize="40870,54652" o:gfxdata="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">
+                <v:roundrect id="Rectangle: Rounded Corners 29" o:spid="_x0000_s1067" style="position:absolute;width:40870;height:54652;visibility:visible;mso-wrap-style:square;v-text-anchor:middle" arcsize="10923f" o:gfxdata="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" filled="f" strokecolor="#09101d [484]" strokeweight="1pt">
                   <v:stroke joinstyle="miter"/>
                 </v:roundrect>
-                <v:shape id="Minus Sign 33" o:spid="_x0000_s1065" style="position:absolute;left:2493;top:1108;width:4087;height:2424;visibility:visible;mso-wrap-style:square;v-text-anchor:middle" coordsize="408709,242455" o:gfxdata="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" path="m54174,92715r300361,l354535,149740r-300361,l54174,92715xe" fillcolor="black [3213]" strokecolor="#09101d [484]" strokeweight="1pt">
+                <v:shape id="Minus Sign 33" o:spid="_x0000_s1068" style="position:absolute;left:2493;top:1108;width:4087;height:2424;visibility:visible;mso-wrap-style:square;v-text-anchor:middle" coordsize="408709,242455" o:gfxdata="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" path="m54174,92715r300361,l354535,149740r-300361,l54174,92715xe" fillcolor="black [3213]" strokecolor="#09101d [484]" strokeweight="1pt">
                   <v:stroke joinstyle="miter"/>
                   <v:path arrowok="t" o:connecttype="custom" o:connectlocs="54174,92715;354535,92715;354535,149740;54174,149740;54174,92715" o:connectangles="0,0,0,0,0"/>
                 </v:shape>
-                <v:shape id="Minus Sign 33" o:spid="_x0000_s1066" style="position:absolute;left:2563;top:3255;width:4083;height:2420;visibility:visible;mso-wrap-style:square;v-text-anchor:middle" coordsize="408305,241935" o:gfxdata="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" path="m54121,92516r300063,l354184,149419r-300063,l54121,92516xe" fillcolor="black [3213]" strokecolor="#09101d [484]" strokeweight="1pt">
+                <v:shape id="Minus Sign 33" o:spid="_x0000_s1069" style="position:absolute;left:2563;top:3255;width:4083;height:2420;visibility:visible;mso-wrap-style:square;v-text-anchor:middle" coordsize="408305,241935" o:gfxdata="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" path="m54121,92516r300063,l354184,149419r-300063,l54121,92516xe" fillcolor="black [3213]" strokecolor="#09101d [484]" strokeweight="1pt">
                   <v:stroke joinstyle="miter"/>
                   <v:path arrowok="t" o:connecttype="custom" o:connectlocs="54121,92516;354184,92516;354184,149419;54121,149419;54121,92516" o:connectangles="0,0,0,0,0"/>
                 </v:shape>
-                <v:roundrect id="Rectangle: Rounded Corners 14" o:spid="_x0000_s1067" style="position:absolute;left:4779;top:5126;width:32598;height:3070;visibility:visible;mso-wrap-style:square;v-text-anchor:middle" arcsize=".5" o:gfxdata="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" filled="f" strokeweight="1pt">
+                <v:roundrect id="Rectangle: Rounded Corners 14" o:spid="_x0000_s1070" style="position:absolute;left:4779;top:5126;width:32598;height:3070;visibility:visible;mso-wrap-style:square;v-text-anchor:middle" arcsize=".5" o:gfxdata="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" filled="f" strokeweight="1pt">
                   <v:stroke joinstyle="miter"/>
                   <v:textbox>
                     <w:txbxContent>
@@ -4601,7 +4797,7 @@
                     </w:txbxContent>
                   </v:textbox>
                 </v:roundrect>
-                <v:shape id="Text Box 24" o:spid="_x0000_s1068" type="#_x0000_t202" style="position:absolute;left:4918;top:5403;width:6707;height:2790;visibility:visible;mso-wrap-style:square;v-text-anchor:top" o:gfxdata="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" fillcolor="white [3201]" stroked="f" strokeweight=".5pt">
+                <v:shape id="Text Box 24" o:spid="_x0000_s1071" type="#_x0000_t202" style="position:absolute;left:4918;top:5403;width:6707;height:2790;visibility:visible;mso-wrap-style:square;v-text-anchor:top" o:gfxdata="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" fillcolor="white [3201]" stroked="f" strokeweight=".5pt">
                   <v:textbox>
                     <w:txbxContent>
                       <w:p>
@@ -4612,7 +4808,7 @@
                     </w:txbxContent>
                   </v:textbox>
                 </v:shape>
-                <v:roundrect id="Rectangle: Rounded Corners 18" o:spid="_x0000_s1069" style="position:absolute;left:20435;top:22860;width:18980;height:3948;visibility:visible;mso-wrap-style:square;v-text-anchor:middle" arcsize=".5" o:gfxdata="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" filled="f" strokecolor="#09101d [484]" strokeweight="1pt">
+                <v:roundrect id="Rectangle: Rounded Corners 18" o:spid="_x0000_s1072" style="position:absolute;left:20435;top:22860;width:18980;height:3948;visibility:visible;mso-wrap-style:square;v-text-anchor:middle" arcsize=".5" o:gfxdata="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" filled="f" strokecolor="#09101d [484]" strokeweight="1pt">
                   <v:stroke joinstyle="miter"/>
                   <v:textbox>
                     <w:txbxContent>
@@ -4633,7 +4829,7 @@
                     </w:txbxContent>
                   </v:textbox>
                 </v:roundrect>
-                <v:roundrect id="Rectangle: Rounded Corners 18" o:spid="_x0000_s1070" style="position:absolute;left:20227;top:27016;width:18980;height:3607;visibility:visible;mso-wrap-style:square;v-text-anchor:middle" arcsize=".5" o:gfxdata="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" filled="f" strokecolor="#09101d [484]" strokeweight="1pt">
+                <v:roundrect id="Rectangle: Rounded Corners 18" o:spid="_x0000_s1073" style="position:absolute;left:20227;top:27016;width:18980;height:3607;visibility:visible;mso-wrap-style:square;v-text-anchor:middle" arcsize=".5" o:gfxdata="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" filled="f" strokecolor="#09101d [484]" strokeweight="1pt">
                   <v:stroke joinstyle="miter"/>
                   <v:textbox>
                     <w:txbxContent>
@@ -4654,7 +4850,7 @@
                     </w:txbxContent>
                   </v:textbox>
                 </v:roundrect>
-                <v:roundrect id="Rectangle: Rounded Corners 18" o:spid="_x0000_s1071" style="position:absolute;left:20296;top:30895;width:18987;height:3609;visibility:visible;mso-wrap-style:square;v-text-anchor:middle" arcsize=".5" o:gfxdata="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" filled="f" strokecolor="#09101d [484]" strokeweight="1pt">
+                <v:roundrect id="Rectangle: Rounded Corners 18" o:spid="_x0000_s1074" style="position:absolute;left:20296;top:30895;width:18987;height:3609;visibility:visible;mso-wrap-style:square;v-text-anchor:middle" arcsize=".5" o:gfxdata="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" filled="f" strokecolor="#09101d [484]" strokeweight="1pt">
                   <v:stroke joinstyle="miter"/>
                   <v:textbox>
                     <w:txbxContent>
@@ -4675,19 +4871,19 @@
                     </w:txbxContent>
                   </v:textbox>
                 </v:roundrect>
-                <v:oval id="Oval 19" o:spid="_x0000_s1072" style="position:absolute;left:20712;top:31172;width:3448;height:2947;visibility:visible;mso-wrap-style:square;v-text-anchor:middle" o:gfxdata="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" fillcolor="#4472c4 [3204]" strokecolor="#09101d [484]" strokeweight="1pt">
+                <v:oval id="Oval 19" o:spid="_x0000_s1075" style="position:absolute;left:20712;top:31172;width:3448;height:2947;visibility:visible;mso-wrap-style:square;v-text-anchor:middle" o:gfxdata="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" fillcolor="#4472c4 [3204]" strokecolor="#09101d [484]" strokeweight="1pt">
                   <v:stroke joinstyle="miter"/>
                 </v:oval>
-                <v:oval id="Oval 19" o:spid="_x0000_s1073" style="position:absolute;left:20574;top:27224;width:3448;height:2946;visibility:visible;mso-wrap-style:square;v-text-anchor:middle" o:gfxdata="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" fillcolor="#4472c4 [3204]" strokecolor="#09101d [484]" strokeweight="1pt">
+                <v:oval id="Oval 19" o:spid="_x0000_s1076" style="position:absolute;left:20574;top:27224;width:3448;height:2946;visibility:visible;mso-wrap-style:square;v-text-anchor:middle" o:gfxdata="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" fillcolor="#4472c4 [3204]" strokecolor="#09101d [484]" strokeweight="1pt">
                   <v:stroke joinstyle="miter"/>
                 </v:oval>
-                <v:oval id="Oval 19" o:spid="_x0000_s1074" style="position:absolute;left:20851;top:23344;width:3448;height:2947;visibility:visible;mso-wrap-style:square;v-text-anchor:middle" o:gfxdata="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" fillcolor="#4472c4 [3204]" strokecolor="#09101d [484]" strokeweight="1pt">
+                <v:oval id="Oval 19" o:spid="_x0000_s1077" style="position:absolute;left:20851;top:23344;width:3448;height:2947;visibility:visible;mso-wrap-style:square;v-text-anchor:middle" o:gfxdata="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" fillcolor="#4472c4 [3204]" strokecolor="#09101d [484]" strokeweight="1pt">
                   <v:stroke joinstyle="miter"/>
                 </v:oval>
-                <v:roundrect id="Rectangle: Rounded Corners 36" o:spid="_x0000_s1075" style="position:absolute;left:1454;top:48768;width:37954;height:4710;visibility:visible;mso-wrap-style:square;v-text-anchor:middle" arcsize=".5" o:gfxdata="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" filled="f" strokecolor="#09101d [484]" strokeweight="1pt">
+                <v:roundrect id="Rectangle: Rounded Corners 36" o:spid="_x0000_s1078" style="position:absolute;left:1454;top:48768;width:37954;height:4710;visibility:visible;mso-wrap-style:square;v-text-anchor:middle" arcsize=".5" o:gfxdata="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" filled="f" strokecolor="#09101d [484]" strokeweight="1pt">
                   <v:stroke joinstyle="miter"/>
                 </v:roundrect>
-                <v:shape id="Text Box 37" o:spid="_x0000_s1076" type="#_x0000_t202" style="position:absolute;left:4918;top:49391;width:7412;height:2979;visibility:visible;mso-wrap-style:square;v-text-anchor:top" o:gfxdata="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" filled="f" stroked="f" strokeweight=".5pt">
+                <v:shape id="Text Box 37" o:spid="_x0000_s1079" type="#_x0000_t202" style="position:absolute;left:4918;top:49391;width:7412;height:2979;visibility:visible;mso-wrap-style:square;v-text-anchor:top" o:gfxdata="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" filled="f" stroked="f" strokeweight=".5pt">
                   <v:textbox>
                     <w:txbxContent>
                       <w:p>
@@ -4708,7 +4904,7 @@
                     </w:txbxContent>
                   </v:textbox>
                 </v:shape>
-                <v:shape id="Text Box 37" o:spid="_x0000_s1077" type="#_x0000_t202" style="position:absolute;left:13785;top:49391;width:5606;height:2978;visibility:visible;mso-wrap-style:square;v-text-anchor:top" o:gfxdata="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" filled="f" stroked="f" strokeweight=".5pt">
+                <v:shape id="Text Box 37" o:spid="_x0000_s1080" type="#_x0000_t202" style="position:absolute;left:13785;top:49391;width:5606;height:2978;visibility:visible;mso-wrap-style:square;v-text-anchor:top" o:gfxdata="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" filled="f" stroked="f" strokeweight=".5pt">
                   <v:textbox>
                     <w:txbxContent>
                       <w:p>
@@ -4729,7 +4925,7 @@
                     </w:txbxContent>
                   </v:textbox>
                 </v:shape>
-                <v:shape id="Text Box 37" o:spid="_x0000_s1078" type="#_x0000_t202" style="position:absolute;left:21682;top:49391;width:5601;height:2978;visibility:visible;mso-wrap-style:square;v-text-anchor:top" o:gfxdata="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" filled="f" stroked="f" strokeweight=".5pt">
+                <v:shape id="Text Box 37" o:spid="_x0000_s1081" type="#_x0000_t202" style="position:absolute;left:21682;top:49391;width:5601;height:2978;visibility:visible;mso-wrap-style:square;v-text-anchor:top" o:gfxdata="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" filled="f" stroked="f" strokeweight=".5pt">
                   <v:textbox>
                     <w:txbxContent>
                       <w:p>
@@ -4750,7 +4946,7 @@
                     </w:txbxContent>
                   </v:textbox>
                 </v:shape>
-                <v:shape id="Text Box 37" o:spid="_x0000_s1079" type="#_x0000_t202" style="position:absolute;left:29787;top:49391;width:6234;height:2979;visibility:visible;mso-wrap-style:square;v-text-anchor:top" o:gfxdata="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" filled="f" stroked="f" strokeweight=".5pt">
+                <v:shape id="Text Box 37" o:spid="_x0000_s1082" type="#_x0000_t202" style="position:absolute;left:29787;top:49391;width:6234;height:2979;visibility:visible;mso-wrap-style:square;v-text-anchor:top" o:gfxdata="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" filled="f" stroked="f" strokeweight=".5pt">
                   <v:textbox>
                     <w:txbxContent>
                       <w:p>
@@ -4771,7 +4967,7 @@
                     </w:txbxContent>
                   </v:textbox>
                 </v:shape>
-                <v:shape id="Text Box 39" o:spid="_x0000_s1080" type="#_x0000_t202" style="position:absolute;left:3325;top:17387;width:12122;height:2909;visibility:visible;mso-wrap-style:square;v-text-anchor:top" o:gfxdata="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" fillcolor="white [3201]" strokeweight=".5pt">
+                <v:shape id="Text Box 39" o:spid="_x0000_s1083" type="#_x0000_t202" style="position:absolute;left:3325;top:17387;width:12122;height:2909;visibility:visible;mso-wrap-style:square;v-text-anchor:top" o:gfxdata="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" fillcolor="white [3201]" strokeweight=".5pt">
                   <v:textbox>
                     <w:txbxContent>
                       <w:p>
@@ -4782,7 +4978,7 @@
                     </w:txbxContent>
                   </v:textbox>
                 </v:shape>
-                <v:rect id="Rectangle 41" o:spid="_x0000_s1081" style="position:absolute;left:2978;top:20296;width:13924;height:14206;visibility:visible;mso-wrap-style:square;v-text-anchor:middle" o:gfxdata="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" strokecolor="#09101d [484]" strokeweight="1pt">
+                <v:rect id="Rectangle 41" o:spid="_x0000_s1084" style="position:absolute;left:2978;top:20296;width:13924;height:14206;visibility:visible;mso-wrap-style:square;v-text-anchor:middle" o:gfxdata="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" strokecolor="#09101d [484]" strokeweight="1pt">
                   <v:fill r:id="rId12" o:title="" recolor="t" rotate="t" type="frame"/>
                 </v:rect>
               </v:group>
@@ -4879,7 +5075,7 @@
       <w:r>
         <w:tab/>
       </w:r>
-      <w:bookmarkStart w:id="5" w:name="_Toc230523412"/>
+      <w:bookmarkStart w:id="5" w:name="_Toc230817736"/>
       <w:r>
         <w:t>Week 2 Reflection.</w:t>
       </w:r>
@@ -4894,9 +5090,12 @@
       <w:pPr>
         <w:pStyle w:val="Heading1"/>
       </w:pPr>
-      <w:r>
+      <w:bookmarkStart w:id="6" w:name="_Toc230817737"/>
+      <w:r>
+        <w:lastRenderedPageBreak/>
         <w:t>Week 3: JavaScript and PHP Basics</w:t>
       </w:r>
+      <w:bookmarkEnd w:id="6"/>
     </w:p>
     <w:p>
       <w:pPr>
@@ -4906,6 +5105,7 @@
           <w:bCs/>
         </w:rPr>
       </w:pPr>
+      <w:bookmarkStart w:id="7" w:name="_Toc230817738"/>
       <w:r>
         <w:t xml:space="preserve">TITLE: </w:t>
       </w:r>
@@ -4915,13 +5115,387 @@
         </w:rPr>
         <w:t>Frontend Interaction and Backend Foundations</w:t>
       </w:r>
+      <w:bookmarkEnd w:id="7"/>
     </w:p>
     <w:p>
       <w:pPr>
-        <w:pStyle w:val="Heading2"/>
+        <w:keepNext/>
       </w:pPr>
       <w:r>
         <w:t xml:space="preserve"> </w:t>
+      </w:r>
+      <w:r>
+        <w:rPr>
+          <w:noProof/>
+        </w:rPr>
+        <w:drawing>
+          <wp:inline distT="0" distB="0" distL="0" distR="0" wp14:anchorId="6D022DCD" wp14:editId="39C39250">
+            <wp:extent cx="5943600" cy="3072765"/>
+            <wp:effectExtent l="0" t="0" r="0" b="0"/>
+            <wp:docPr id="661298064" name="Picture 51"/>
+            <wp:cNvGraphicFramePr>
+              <a:graphicFrameLocks xmlns:a="http://schemas.openxmlformats.org/drawingml/2006/main" noChangeAspect="1"/>
+            </wp:cNvGraphicFramePr>
+            <a:graphic xmlns:a="http://schemas.openxmlformats.org/drawingml/2006/main">
+              <a:graphicData uri="http://schemas.openxmlformats.org/drawingml/2006/picture">
+                <pic:pic xmlns:pic="http://schemas.openxmlformats.org/drawingml/2006/picture">
+                  <pic:nvPicPr>
+                    <pic:cNvPr id="661298064" name="Picture 661298064"/>
+                    <pic:cNvPicPr/>
+                  </pic:nvPicPr>
+                  <pic:blipFill>
+                    <a:blip r:embed="rId14">
+                      <a:extLst>
+                        <a:ext uri="{28A0092B-C50C-407E-A947-70E740481C1C}">
+                          <a14:useLocalDpi xmlns:a14="http://schemas.microsoft.com/office/drawing/2010/main" val="0"/>
+                        </a:ext>
+                      </a:extLst>
+                    </a:blip>
+                    <a:stretch>
+                      <a:fillRect/>
+                    </a:stretch>
+                  </pic:blipFill>
+                  <pic:spPr>
+                    <a:xfrm>
+                      <a:off x="0" y="0"/>
+                      <a:ext cx="5943600" cy="3072765"/>
+                    </a:xfrm>
+                    <a:prstGeom prst="rect">
+                      <a:avLst/>
+                    </a:prstGeom>
+                  </pic:spPr>
+                </pic:pic>
+              </a:graphicData>
+            </a:graphic>
+          </wp:inline>
+        </w:drawing>
+      </w:r>
+    </w:p>
+    <w:p>
+      <w:pPr>
+        <w:pStyle w:val="Caption"/>
+      </w:pPr>
+      <w:r>
+        <w:t xml:space="preserve">Figure </w:t>
+      </w:r>
+      <w:fldSimple w:instr=" SEQ Figure \* ARABIC ">
+        <w:r>
+          <w:rPr>
+            <w:noProof/>
+          </w:rPr>
+          <w:t>10</w:t>
+        </w:r>
+      </w:fldSimple>
+      <w:r>
+        <w:t>: JavaScript form validation</w:t>
+      </w:r>
+    </w:p>
+    <w:p>
+      <w:pPr>
+        <w:keepNext/>
+      </w:pPr>
+      <w:r>
+        <w:rPr>
+          <w:noProof/>
+        </w:rPr>
+        <w:drawing>
+          <wp:inline distT="0" distB="0" distL="0" distR="0" wp14:anchorId="70D40E50" wp14:editId="7A12F609">
+            <wp:extent cx="4982270" cy="3296110"/>
+            <wp:effectExtent l="0" t="0" r="8890" b="0"/>
+            <wp:docPr id="767702237" name="Picture 52"/>
+            <wp:cNvGraphicFramePr>
+              <a:graphicFrameLocks xmlns:a="http://schemas.openxmlformats.org/drawingml/2006/main" noChangeAspect="1"/>
+            </wp:cNvGraphicFramePr>
+            <a:graphic xmlns:a="http://schemas.openxmlformats.org/drawingml/2006/main">
+              <a:graphicData uri="http://schemas.openxmlformats.org/drawingml/2006/picture">
+                <pic:pic xmlns:pic="http://schemas.openxmlformats.org/drawingml/2006/picture">
+                  <pic:nvPicPr>
+                    <pic:cNvPr id="767702237" name="Picture 767702237"/>
+                    <pic:cNvPicPr/>
+                  </pic:nvPicPr>
+                  <pic:blipFill>
+                    <a:blip r:embed="rId15">
+                      <a:extLst>
+                        <a:ext uri="{28A0092B-C50C-407E-A947-70E740481C1C}">
+                          <a14:useLocalDpi xmlns:a14="http://schemas.microsoft.com/office/drawing/2010/main" val="0"/>
+                        </a:ext>
+                      </a:extLst>
+                    </a:blip>
+                    <a:stretch>
+                      <a:fillRect/>
+                    </a:stretch>
+                  </pic:blipFill>
+                  <pic:spPr>
+                    <a:xfrm>
+                      <a:off x="0" y="0"/>
+                      <a:ext cx="4982270" cy="3296110"/>
+                    </a:xfrm>
+                    <a:prstGeom prst="rect">
+                      <a:avLst/>
+                    </a:prstGeom>
+                  </pic:spPr>
+                </pic:pic>
+              </a:graphicData>
+            </a:graphic>
+          </wp:inline>
+        </w:drawing>
+      </w:r>
+    </w:p>
+    <w:p>
+      <w:pPr>
+        <w:pStyle w:val="Caption"/>
+      </w:pPr>
+      <w:r>
+        <w:t xml:space="preserve">Figure </w:t>
+      </w:r>
+      <w:fldSimple w:instr=" SEQ Figure \* ARABIC ">
+        <w:r>
+          <w:rPr>
+            <w:noProof/>
+          </w:rPr>
+          <w:t>11</w:t>
+        </w:r>
+      </w:fldSimple>
+      <w:r>
+        <w:t>: Password Strength Checker</w:t>
+      </w:r>
+    </w:p>
+    <w:p>
+      <w:pPr>
+        <w:keepNext/>
+      </w:pPr>
+      <w:r>
+        <w:rPr>
+          <w:noProof/>
+        </w:rPr>
+        <w:lastRenderedPageBreak/>
+        <w:drawing>
+          <wp:inline distT="0" distB="0" distL="0" distR="0" wp14:anchorId="33CA961A" wp14:editId="513D2FB1">
+            <wp:extent cx="6492240" cy="5257800"/>
+            <wp:effectExtent l="0" t="0" r="3810" b="0"/>
+            <wp:docPr id="1256373591" name="Picture 53"/>
+            <wp:cNvGraphicFramePr>
+              <a:graphicFrameLocks xmlns:a="http://schemas.openxmlformats.org/drawingml/2006/main" noChangeAspect="1"/>
+            </wp:cNvGraphicFramePr>
+            <a:graphic xmlns:a="http://schemas.openxmlformats.org/drawingml/2006/main">
+              <a:graphicData uri="http://schemas.openxmlformats.org/drawingml/2006/picture">
+                <pic:pic xmlns:pic="http://schemas.openxmlformats.org/drawingml/2006/picture">
+                  <pic:nvPicPr>
+                    <pic:cNvPr id="1256373591" name="Picture 1256373591"/>
+                    <pic:cNvPicPr/>
+                  </pic:nvPicPr>
+                  <pic:blipFill>
+                    <a:blip r:embed="rId16">
+                      <a:extLst>
+                        <a:ext uri="{28A0092B-C50C-407E-A947-70E740481C1C}">
+                          <a14:useLocalDpi xmlns:a14="http://schemas.microsoft.com/office/drawing/2010/main" val="0"/>
+                        </a:ext>
+                      </a:extLst>
+                    </a:blip>
+                    <a:stretch>
+                      <a:fillRect/>
+                    </a:stretch>
+                  </pic:blipFill>
+                  <pic:spPr>
+                    <a:xfrm>
+                      <a:off x="0" y="0"/>
+                      <a:ext cx="6492545" cy="5258047"/>
+                    </a:xfrm>
+                    <a:prstGeom prst="rect">
+                      <a:avLst/>
+                    </a:prstGeom>
+                  </pic:spPr>
+                </pic:pic>
+              </a:graphicData>
+            </a:graphic>
+          </wp:inline>
+        </w:drawing>
+      </w:r>
+    </w:p>
+    <w:p>
+      <w:pPr>
+        <w:pStyle w:val="Caption"/>
+      </w:pPr>
+      <w:r>
+        <w:t xml:space="preserve">Figure </w:t>
+      </w:r>
+      <w:fldSimple w:instr=" SEQ Figure \* ARABIC ">
+        <w:r>
+          <w:rPr>
+            <w:noProof/>
+          </w:rPr>
+          <w:t>12</w:t>
+        </w:r>
+      </w:fldSimple>
+      <w:r>
+        <w:t>: PHP Syntax practice</w:t>
+      </w:r>
+    </w:p>
+    <w:p>
+      <w:pPr>
+        <w:keepNext/>
+      </w:pPr>
+      <w:r>
+        <w:rPr>
+          <w:noProof/>
+        </w:rPr>
+        <w:drawing>
+          <wp:inline distT="0" distB="0" distL="0" distR="0" wp14:anchorId="1678A950" wp14:editId="346AFB0D">
+            <wp:extent cx="5943600" cy="2065655"/>
+            <wp:effectExtent l="0" t="0" r="0" b="0"/>
+            <wp:docPr id="58846422" name="Picture 54"/>
+            <wp:cNvGraphicFramePr>
+              <a:graphicFrameLocks xmlns:a="http://schemas.openxmlformats.org/drawingml/2006/main" noChangeAspect="1"/>
+            </wp:cNvGraphicFramePr>
+            <a:graphic xmlns:a="http://schemas.openxmlformats.org/drawingml/2006/main">
+              <a:graphicData uri="http://schemas.openxmlformats.org/drawingml/2006/picture">
+                <pic:pic xmlns:pic="http://schemas.openxmlformats.org/drawingml/2006/picture">
+                  <pic:nvPicPr>
+                    <pic:cNvPr id="58846422" name="Picture 58846422"/>
+                    <pic:cNvPicPr/>
+                  </pic:nvPicPr>
+                  <pic:blipFill>
+                    <a:blip r:embed="rId17">
+                      <a:extLst>
+                        <a:ext uri="{28A0092B-C50C-407E-A947-70E740481C1C}">
+                          <a14:useLocalDpi xmlns:a14="http://schemas.microsoft.com/office/drawing/2010/main" val="0"/>
+                        </a:ext>
+                      </a:extLst>
+                    </a:blip>
+                    <a:stretch>
+                      <a:fillRect/>
+                    </a:stretch>
+                  </pic:blipFill>
+                  <pic:spPr>
+                    <a:xfrm>
+                      <a:off x="0" y="0"/>
+                      <a:ext cx="5943600" cy="2065655"/>
+                    </a:xfrm>
+                    <a:prstGeom prst="rect">
+                      <a:avLst/>
+                    </a:prstGeom>
+                  </pic:spPr>
+                </pic:pic>
+              </a:graphicData>
+            </a:graphic>
+          </wp:inline>
+        </w:drawing>
+      </w:r>
+    </w:p>
+    <w:p>
+      <w:pPr>
+        <w:pStyle w:val="Caption"/>
+      </w:pPr>
+      <w:r>
+        <w:t xml:space="preserve">Figure </w:t>
+      </w:r>
+      <w:fldSimple w:instr=" SEQ Figure \* ARABIC ">
+        <w:r>
+          <w:rPr>
+            <w:noProof/>
+          </w:rPr>
+          <w:t>13</w:t>
+        </w:r>
+      </w:fldSimple>
+      <w:r>
+        <w:t>: Database connection script</w:t>
+      </w:r>
+    </w:p>
+    <w:p>
+      <w:pPr>
+        <w:keepNext/>
+      </w:pPr>
+      <w:r>
+        <w:rPr>
+          <w:noProof/>
+        </w:rPr>
+        <w:lastRenderedPageBreak/>
+        <w:drawing>
+          <wp:inline distT="0" distB="0" distL="0" distR="0" wp14:anchorId="59BC2312" wp14:editId="2AC5C524">
+            <wp:extent cx="5943600" cy="257175"/>
+            <wp:effectExtent l="0" t="0" r="0" b="9525"/>
+            <wp:docPr id="336808111" name="Picture 55"/>
+            <wp:cNvGraphicFramePr>
+              <a:graphicFrameLocks xmlns:a="http://schemas.openxmlformats.org/drawingml/2006/main" noChangeAspect="1"/>
+            </wp:cNvGraphicFramePr>
+            <a:graphic xmlns:a="http://schemas.openxmlformats.org/drawingml/2006/main">
+              <a:graphicData uri="http://schemas.openxmlformats.org/drawingml/2006/picture">
+                <pic:pic xmlns:pic="http://schemas.openxmlformats.org/drawingml/2006/picture">
+                  <pic:nvPicPr>
+                    <pic:cNvPr id="336808111" name="Picture 336808111"/>
+                    <pic:cNvPicPr/>
+                  </pic:nvPicPr>
+                  <pic:blipFill>
+                    <a:blip r:embed="rId18">
+                      <a:extLst>
+                        <a:ext uri="{28A0092B-C50C-407E-A947-70E740481C1C}">
+                          <a14:useLocalDpi xmlns:a14="http://schemas.microsoft.com/office/drawing/2010/main" val="0"/>
+                        </a:ext>
+                      </a:extLst>
+                    </a:blip>
+                    <a:stretch>
+                      <a:fillRect/>
+                    </a:stretch>
+                  </pic:blipFill>
+                  <pic:spPr>
+                    <a:xfrm>
+                      <a:off x="0" y="0"/>
+                      <a:ext cx="5943600" cy="257175"/>
+                    </a:xfrm>
+                    <a:prstGeom prst="rect">
+                      <a:avLst/>
+                    </a:prstGeom>
+                  </pic:spPr>
+                </pic:pic>
+              </a:graphicData>
+            </a:graphic>
+          </wp:inline>
+        </w:drawing>
+      </w:r>
+    </w:p>
+    <w:p>
+      <w:pPr>
+        <w:pStyle w:val="Caption"/>
+      </w:pPr>
+      <w:r>
+        <w:t xml:space="preserve">Figure </w:t>
+      </w:r>
+      <w:fldSimple w:instr=" SEQ Figure \* ARABIC ">
+        <w:r>
+          <w:rPr>
+            <w:noProof/>
+          </w:rPr>
+          <w:t>14</w:t>
+        </w:r>
+      </w:fldSimple>
+      <w:r>
+        <w:t>: Dynamic user input handling</w:t>
+      </w:r>
+    </w:p>
+    <w:p>
+      <w:pPr>
+        <w:pStyle w:val="Heading3"/>
+      </w:pPr>
+      <w:bookmarkStart w:id="8" w:name="_Toc230817739"/>
+      <w:r>
+        <w:t>Week 3 Reflection</w:t>
+      </w:r>
+      <w:bookmarkEnd w:id="8"/>
+    </w:p>
+    <w:p>
+      <w:r>
+        <w:t>The frontend and the backend interact via HTTP requests where the user inputs data and the backend process it and returns a response as a HTML. The purpose of validation is to ensure data integrity and security by preventing malicious or wrong input from entering the system. For the technologies used, PHP was used as the backend for data processing, HTML for developing the frontend and MySQL for the database.</w:t>
+      </w:r>
+    </w:p>
+    <w:p>
+      <w:pPr>
+        <w:pStyle w:val="Heading1"/>
+      </w:pPr>
+      <w:r>
+        <w:t>Week 4</w:t>
+      </w:r>
+      <w:r>
+        <w:t>:</w:t>
       </w:r>
     </w:p>
     <w:sectPr>
@@ -5861,6 +6435,7 @@
   <w:style w:type="character" w:default="1" w:styleId="DefaultParagraphFont">
     <w:name w:val="Default Paragraph Font"/>
     <w:uiPriority w:val="1"/>
+    <w:semiHidden/>
     <w:unhideWhenUsed/>
   </w:style>
   <w:style w:type="table" w:default="1" w:styleId="TableNormal">

</xml_diff>

<commit_message>
added info to document
</commit_message>
<xml_diff>
--- a/BIT3208_Project/Project_documentation.docx
+++ b/BIT3208_Project/Project_documentation.docx
@@ -123,8 +123,16 @@
       <w:r>
         <w:t xml:space="preserve"> </w:t>
       </w:r>
-      <w:r>
-        <w:t>https://github.com/ivanamani/BIT3208_Project</w:t>
+      <w:hyperlink r:id="rId6" w:history="1">
+        <w:r>
+          <w:rPr>
+            <w:rStyle w:val="Hyperlink"/>
+          </w:rPr>
+          <w:t>https://github.com/ivanamani/BIT3208_Project</w:t>
+        </w:r>
+      </w:hyperlink>
+      <w:r>
+        <w:t xml:space="preserve"> </w:t>
       </w:r>
     </w:p>
     <w:p>
@@ -209,7 +217,7 @@
           <w:r>
             <w:fldChar w:fldCharType="separate"/>
           </w:r>
-          <w:hyperlink w:anchor="_Toc230817731" w:history="1">
+          <w:hyperlink w:anchor="_Toc230818577" w:history="1">
             <w:r>
               <w:rPr>
                 <w:rStyle w:val="Hyperlink"/>
@@ -236,7 +244,7 @@
                 <w:noProof/>
                 <w:webHidden/>
               </w:rPr>
-              <w:instrText xml:space="preserve"> PAGEREF _Toc230817731 \h </w:instrText>
+              <w:instrText xml:space="preserve"> PAGEREF _Toc230818577 \h </w:instrText>
             </w:r>
             <w:r>
               <w:rPr>
@@ -278,7 +286,7 @@
               <w:noProof/>
             </w:rPr>
           </w:pPr>
-          <w:hyperlink w:anchor="_Toc230817732" w:history="1">
+          <w:hyperlink w:anchor="_Toc230818578" w:history="1">
             <w:r>
               <w:rPr>
                 <w:rStyle w:val="Hyperlink"/>
@@ -314,7 +322,7 @@
                 <w:noProof/>
                 <w:webHidden/>
               </w:rPr>
-              <w:instrText xml:space="preserve"> PAGEREF _Toc230817732 \h </w:instrText>
+              <w:instrText xml:space="preserve"> PAGEREF _Toc230818578 \h </w:instrText>
             </w:r>
             <w:r>
               <w:rPr>
@@ -356,7 +364,7 @@
               <w:noProof/>
             </w:rPr>
           </w:pPr>
-          <w:hyperlink w:anchor="_Toc230817733" w:history="1">
+          <w:hyperlink w:anchor="_Toc230818579" w:history="1">
             <w:r>
               <w:rPr>
                 <w:rStyle w:val="Hyperlink"/>
@@ -383,7 +391,7 @@
                 <w:noProof/>
                 <w:webHidden/>
               </w:rPr>
-              <w:instrText xml:space="preserve"> PAGEREF _Toc230817733 \h </w:instrText>
+              <w:instrText xml:space="preserve"> PAGEREF _Toc230818579 \h </w:instrText>
             </w:r>
             <w:r>
               <w:rPr>
@@ -425,7 +433,7 @@
               <w:noProof/>
             </w:rPr>
           </w:pPr>
-          <w:hyperlink w:anchor="_Toc230817734" w:history="1">
+          <w:hyperlink w:anchor="_Toc230818580" w:history="1">
             <w:r>
               <w:rPr>
                 <w:rStyle w:val="Hyperlink"/>
@@ -452,7 +460,7 @@
                 <w:noProof/>
                 <w:webHidden/>
               </w:rPr>
-              <w:instrText xml:space="preserve"> PAGEREF _Toc230817734 \h </w:instrText>
+              <w:instrText xml:space="preserve"> PAGEREF _Toc230818580 \h </w:instrText>
             </w:r>
             <w:r>
               <w:rPr>
@@ -494,7 +502,7 @@
               <w:noProof/>
             </w:rPr>
           </w:pPr>
-          <w:hyperlink w:anchor="_Toc230817735" w:history="1">
+          <w:hyperlink w:anchor="_Toc230818581" w:history="1">
             <w:r>
               <w:rPr>
                 <w:rStyle w:val="Hyperlink"/>
@@ -521,7 +529,7 @@
                 <w:noProof/>
                 <w:webHidden/>
               </w:rPr>
-              <w:instrText xml:space="preserve"> PAGEREF _Toc230817735 \h </w:instrText>
+              <w:instrText xml:space="preserve"> PAGEREF _Toc230818581 \h </w:instrText>
             </w:r>
             <w:r>
               <w:rPr>
@@ -563,7 +571,7 @@
               <w:noProof/>
             </w:rPr>
           </w:pPr>
-          <w:hyperlink w:anchor="_Toc230817736" w:history="1">
+          <w:hyperlink w:anchor="_Toc230818582" w:history="1">
             <w:r>
               <w:rPr>
                 <w:rStyle w:val="Hyperlink"/>
@@ -590,7 +598,7 @@
                 <w:noProof/>
                 <w:webHidden/>
               </w:rPr>
-              <w:instrText xml:space="preserve"> PAGEREF _Toc230817736 \h </w:instrText>
+              <w:instrText xml:space="preserve"> PAGEREF _Toc230818582 \h </w:instrText>
             </w:r>
             <w:r>
               <w:rPr>
@@ -632,7 +640,7 @@
               <w:noProof/>
             </w:rPr>
           </w:pPr>
-          <w:hyperlink w:anchor="_Toc230817737" w:history="1">
+          <w:hyperlink w:anchor="_Toc230818583" w:history="1">
             <w:r>
               <w:rPr>
                 <w:rStyle w:val="Hyperlink"/>
@@ -659,7 +667,7 @@
                 <w:noProof/>
                 <w:webHidden/>
               </w:rPr>
-              <w:instrText xml:space="preserve"> PAGEREF _Toc230817737 \h </w:instrText>
+              <w:instrText xml:space="preserve"> PAGEREF _Toc230818583 \h </w:instrText>
             </w:r>
             <w:r>
               <w:rPr>
@@ -701,7 +709,7 @@
               <w:noProof/>
             </w:rPr>
           </w:pPr>
-          <w:hyperlink w:anchor="_Toc230817738" w:history="1">
+          <w:hyperlink w:anchor="_Toc230818584" w:history="1">
             <w:r>
               <w:rPr>
                 <w:rStyle w:val="Hyperlink"/>
@@ -736,7 +744,7 @@
                 <w:noProof/>
                 <w:webHidden/>
               </w:rPr>
-              <w:instrText xml:space="preserve"> PAGEREF _Toc230817738 \h </w:instrText>
+              <w:instrText xml:space="preserve"> PAGEREF _Toc230818584 \h </w:instrText>
             </w:r>
             <w:r>
               <w:rPr>
@@ -778,7 +786,7 @@
               <w:noProof/>
             </w:rPr>
           </w:pPr>
-          <w:hyperlink w:anchor="_Toc230817739" w:history="1">
+          <w:hyperlink w:anchor="_Toc230818585" w:history="1">
             <w:r>
               <w:rPr>
                 <w:rStyle w:val="Hyperlink"/>
@@ -805,7 +813,76 @@
                 <w:noProof/>
                 <w:webHidden/>
               </w:rPr>
-              <w:instrText xml:space="preserve"> PAGEREF _Toc230817739 \h </w:instrText>
+              <w:instrText xml:space="preserve"> PAGEREF _Toc230818585 \h </w:instrText>
+            </w:r>
+            <w:r>
+              <w:rPr>
+                <w:noProof/>
+                <w:webHidden/>
+              </w:rPr>
+            </w:r>
+            <w:r>
+              <w:rPr>
+                <w:noProof/>
+                <w:webHidden/>
+              </w:rPr>
+              <w:fldChar w:fldCharType="separate"/>
+            </w:r>
+            <w:r>
+              <w:rPr>
+                <w:noProof/>
+                <w:webHidden/>
+              </w:rPr>
+              <w:t>11</w:t>
+            </w:r>
+            <w:r>
+              <w:rPr>
+                <w:noProof/>
+                <w:webHidden/>
+              </w:rPr>
+              <w:fldChar w:fldCharType="end"/>
+            </w:r>
+          </w:hyperlink>
+        </w:p>
+        <w:p>
+          <w:pPr>
+            <w:pStyle w:val="TOC1"/>
+            <w:tabs>
+              <w:tab w:val="right" w:leader="dot" w:pos="9350"/>
+            </w:tabs>
+            <w:rPr>
+              <w:rFonts w:eastAsiaTheme="minorEastAsia"/>
+              <w:noProof/>
+            </w:rPr>
+          </w:pPr>
+          <w:hyperlink w:anchor="_Toc230818586" w:history="1">
+            <w:r>
+              <w:rPr>
+                <w:rStyle w:val="Hyperlink"/>
+                <w:noProof/>
+              </w:rPr>
+              <w:t>Week 4:</w:t>
+            </w:r>
+            <w:r>
+              <w:rPr>
+                <w:noProof/>
+                <w:webHidden/>
+              </w:rPr>
+              <w:tab/>
+            </w:r>
+            <w:r>
+              <w:rPr>
+                <w:noProof/>
+                <w:webHidden/>
+              </w:rPr>
+              <w:fldChar w:fldCharType="begin"/>
+            </w:r>
+            <w:r>
+              <w:rPr>
+                <w:noProof/>
+                <w:webHidden/>
+              </w:rPr>
+              <w:instrText xml:space="preserve"> PAGEREF _Toc230818586 \h </w:instrText>
             </w:r>
             <w:r>
               <w:rPr>
@@ -873,7 +950,7 @@
       <w:pPr>
         <w:pStyle w:val="Heading1"/>
       </w:pPr>
-      <w:bookmarkStart w:id="0" w:name="_Toc230817731"/>
+      <w:bookmarkStart w:id="0" w:name="_Toc230818577"/>
       <w:r>
         <w:lastRenderedPageBreak/>
         <w:t>WEEK ONE: LOCAL ENVIRONMENT SETUP</w:t>
@@ -888,7 +965,7 @@
           <w:bCs/>
         </w:rPr>
       </w:pPr>
-      <w:bookmarkStart w:id="1" w:name="_Toc230817732"/>
+      <w:bookmarkStart w:id="1" w:name="_Toc230818578"/>
       <w:r>
         <w:t xml:space="preserve">TITLE: </w:t>
       </w:r>
@@ -923,7 +1000,7 @@
                     <pic:cNvPicPr/>
                   </pic:nvPicPr>
                   <pic:blipFill>
-                    <a:blip r:embed="rId6">
+                    <a:blip r:embed="rId7">
                       <a:extLst>
                         <a:ext uri="{28A0092B-C50C-407E-A947-70E740481C1C}">
                           <a14:useLocalDpi xmlns:a14="http://schemas.microsoft.com/office/drawing/2010/main" val="0"/>
@@ -1001,7 +1078,7 @@
                     <pic:cNvPicPr/>
                   </pic:nvPicPr>
                   <pic:blipFill>
-                    <a:blip r:embed="rId7">
+                    <a:blip r:embed="rId8">
                       <a:extLst>
                         <a:ext uri="{28A0092B-C50C-407E-A947-70E740481C1C}">
                           <a14:useLocalDpi xmlns:a14="http://schemas.microsoft.com/office/drawing/2010/main" val="0"/>
@@ -1078,7 +1155,7 @@
                     <pic:cNvPicPr/>
                   </pic:nvPicPr>
                   <pic:blipFill>
-                    <a:blip r:embed="rId8">
+                    <a:blip r:embed="rId9">
                       <a:extLst>
                         <a:ext uri="{28A0092B-C50C-407E-A947-70E740481C1C}">
                           <a14:useLocalDpi xmlns:a14="http://schemas.microsoft.com/office/drawing/2010/main" val="0"/>
@@ -1156,7 +1233,7 @@
                     <pic:cNvPicPr/>
                   </pic:nvPicPr>
                   <pic:blipFill>
-                    <a:blip r:embed="rId9">
+                    <a:blip r:embed="rId10">
                       <a:extLst>
                         <a:ext uri="{28A0092B-C50C-407E-A947-70E740481C1C}">
                           <a14:useLocalDpi xmlns:a14="http://schemas.microsoft.com/office/drawing/2010/main" val="0"/>
@@ -1233,7 +1310,7 @@
                     <pic:cNvPicPr/>
                   </pic:nvPicPr>
                   <pic:blipFill>
-                    <a:blip r:embed="rId10">
+                    <a:blip r:embed="rId11">
                       <a:extLst>
                         <a:ext uri="{28A0092B-C50C-407E-A947-70E740481C1C}">
                           <a14:useLocalDpi xmlns:a14="http://schemas.microsoft.com/office/drawing/2010/main" val="0"/>
@@ -1293,7 +1370,7 @@
       <w:pPr>
         <w:pStyle w:val="Heading3"/>
       </w:pPr>
-      <w:bookmarkStart w:id="2" w:name="_Toc230817733"/>
+      <w:bookmarkStart w:id="2" w:name="_Toc230818579"/>
       <w:r>
         <w:t>WEEK 1 REFLECTIONS</w:t>
       </w:r>
@@ -1329,7 +1406,7 @@
       <w:pPr>
         <w:pStyle w:val="Heading1"/>
       </w:pPr>
-      <w:bookmarkStart w:id="3" w:name="_Toc230817734"/>
+      <w:bookmarkStart w:id="3" w:name="_Toc230818580"/>
       <w:r>
         <w:t>WEEK 2: WIREFRAMES AND GUI DESIGN.</w:t>
       </w:r>
@@ -1339,7 +1416,7 @@
       <w:pPr>
         <w:pStyle w:val="Heading2"/>
       </w:pPr>
-      <w:bookmarkStart w:id="4" w:name="_Toc230817735"/>
+      <w:bookmarkStart w:id="4" w:name="_Toc230818581"/>
       <w:r>
         <w:t>TITLE: USER INTERFACEE PLANNING AND SYSTEM DESIGN</w:t>
       </w:r>
@@ -4736,7 +4813,7 @@
                             <a:avLst/>
                           </a:prstGeom>
                           <a:blipFill>
-                            <a:blip r:embed="rId11"/>
+                            <a:blip r:embed="rId12"/>
                             <a:stretch>
                               <a:fillRect/>
                             </a:stretch>
@@ -4979,7 +5056,7 @@
                   </v:textbox>
                 </v:shape>
                 <v:rect id="Rectangle 41" o:spid="_x0000_s1084" style="position:absolute;left:2978;top:20296;width:13924;height:14206;visibility:visible;mso-wrap-style:square;v-text-anchor:middle" o:gfxdata="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" strokecolor="#09101d [484]" strokeweight="1pt">
-                  <v:fill r:id="rId12" o:title="" recolor="t" rotate="t" type="frame"/>
+                  <v:fill r:id="rId13" o:title="" recolor="t" rotate="t" type="frame"/>
                 </v:rect>
               </v:group>
             </w:pict>
@@ -5015,7 +5092,7 @@
                     <pic:cNvPicPr/>
                   </pic:nvPicPr>
                   <pic:blipFill>
-                    <a:blip r:embed="rId13">
+                    <a:blip r:embed="rId14">
                       <a:extLst>
                         <a:ext uri="{28A0092B-C50C-407E-A947-70E740481C1C}">
                           <a14:useLocalDpi xmlns:a14="http://schemas.microsoft.com/office/drawing/2010/main" val="0"/>
@@ -5075,7 +5152,7 @@
       <w:r>
         <w:tab/>
       </w:r>
-      <w:bookmarkStart w:id="5" w:name="_Toc230817736"/>
+      <w:bookmarkStart w:id="5" w:name="_Toc230818582"/>
       <w:r>
         <w:t>Week 2 Reflection.</w:t>
       </w:r>
@@ -5090,7 +5167,7 @@
       <w:pPr>
         <w:pStyle w:val="Heading1"/>
       </w:pPr>
-      <w:bookmarkStart w:id="6" w:name="_Toc230817737"/>
+      <w:bookmarkStart w:id="6" w:name="_Toc230818583"/>
       <w:r>
         <w:lastRenderedPageBreak/>
         <w:t>Week 3: JavaScript and PHP Basics</w:t>
@@ -5105,7 +5182,7 @@
           <w:bCs/>
         </w:rPr>
       </w:pPr>
-      <w:bookmarkStart w:id="7" w:name="_Toc230817738"/>
+      <w:bookmarkStart w:id="7" w:name="_Toc230818584"/>
       <w:r>
         <w:t xml:space="preserve">TITLE: </w:t>
       </w:r>
@@ -5144,7 +5221,7 @@
                     <pic:cNvPicPr/>
                   </pic:nvPicPr>
                   <pic:blipFill>
-                    <a:blip r:embed="rId14">
+                    <a:blip r:embed="rId15">
                       <a:extLst>
                         <a:ext uri="{28A0092B-C50C-407E-A947-70E740481C1C}">
                           <a14:useLocalDpi xmlns:a14="http://schemas.microsoft.com/office/drawing/2010/main" val="0"/>
@@ -5214,7 +5291,7 @@
                     <pic:cNvPicPr/>
                   </pic:nvPicPr>
                   <pic:blipFill>
-                    <a:blip r:embed="rId15">
+                    <a:blip r:embed="rId16">
                       <a:extLst>
                         <a:ext uri="{28A0092B-C50C-407E-A947-70E740481C1C}">
                           <a14:useLocalDpi xmlns:a14="http://schemas.microsoft.com/office/drawing/2010/main" val="0"/>
@@ -5285,7 +5362,7 @@
                     <pic:cNvPicPr/>
                   </pic:nvPicPr>
                   <pic:blipFill>
-                    <a:blip r:embed="rId16">
+                    <a:blip r:embed="rId17">
                       <a:extLst>
                         <a:ext uri="{28A0092B-C50C-407E-A947-70E740481C1C}">
                           <a14:useLocalDpi xmlns:a14="http://schemas.microsoft.com/office/drawing/2010/main" val="0"/>
@@ -5355,7 +5432,7 @@
                     <pic:cNvPicPr/>
                   </pic:nvPicPr>
                   <pic:blipFill>
-                    <a:blip r:embed="rId17">
+                    <a:blip r:embed="rId18">
                       <a:extLst>
                         <a:ext uri="{28A0092B-C50C-407E-A947-70E740481C1C}">
                           <a14:useLocalDpi xmlns:a14="http://schemas.microsoft.com/office/drawing/2010/main" val="0"/>
@@ -5426,7 +5503,7 @@
                     <pic:cNvPicPr/>
                   </pic:nvPicPr>
                   <pic:blipFill>
-                    <a:blip r:embed="rId18">
+                    <a:blip r:embed="rId19">
                       <a:extLst>
                         <a:ext uri="{28A0092B-C50C-407E-A947-70E740481C1C}">
                           <a14:useLocalDpi xmlns:a14="http://schemas.microsoft.com/office/drawing/2010/main" val="0"/>
@@ -5476,7 +5553,7 @@
       <w:pPr>
         <w:pStyle w:val="Heading3"/>
       </w:pPr>
-      <w:bookmarkStart w:id="8" w:name="_Toc230817739"/>
+      <w:bookmarkStart w:id="8" w:name="_Toc230818585"/>
       <w:r>
         <w:t>Week 3 Reflection</w:t>
       </w:r>
@@ -5491,12 +5568,14 @@
       <w:pPr>
         <w:pStyle w:val="Heading1"/>
       </w:pPr>
+      <w:bookmarkStart w:id="9" w:name="_Toc230818586"/>
       <w:r>
         <w:t>Week 4</w:t>
       </w:r>
       <w:r>
         <w:t>:</w:t>
       </w:r>
+      <w:bookmarkEnd w:id="9"/>
     </w:p>
     <w:sectPr>
       <w:pgSz w:w="12240" w:h="15840"/>

</xml_diff>